<commit_message>
[fix] ppt & docx
</commit_message>
<xml_diff>
--- a/팀_RLCC_최종보고서.docx
+++ b/팀_RLCC_최종보고서.docx
@@ -23,7 +23,6 @@
         </w:rPr>
         <w:t xml:space="preserve">프로젝트 제목: </w:t>
       </w:r>
-      <w:proofErr w:type="gramStart"/>
       <w:r>
         <w:rPr>
           <w:rFonts w:asciiTheme="majorHAnsi" w:eastAsiaTheme="majorHAnsi" w:hAnsiTheme="majorHAnsi" w:hint="eastAsia"/>
@@ -42,41 +41,18 @@
           <w:sz w:val="28"/>
           <w:szCs w:val="32"/>
         </w:rPr>
-        <w:t>새</w:t>
-      </w:r>
-      <w:proofErr w:type="gramEnd"/>
-      <w:r>
-        <w:rPr>
-          <w:rFonts w:asciiTheme="majorHAnsi" w:eastAsiaTheme="majorHAnsi" w:hAnsiTheme="majorHAnsi"/>
+        <w:t>새 키우기</w:t>
+      </w:r>
+      <w:r>
+        <w:rPr>
+          <w:rFonts w:asciiTheme="majorHAnsi" w:eastAsiaTheme="majorHAnsi" w:hAnsiTheme="majorHAnsi" w:hint="eastAsia"/>
           <w:b/>
           <w:bCs/>
           <w:sz w:val="28"/>
           <w:szCs w:val="32"/>
         </w:rPr>
-        <w:t xml:space="preserve"> </w:t>
-      </w:r>
-      <w:proofErr w:type="gramStart"/>
-      <w:r>
-        <w:rPr>
-          <w:rFonts w:asciiTheme="majorHAnsi" w:eastAsiaTheme="majorHAnsi" w:hAnsiTheme="majorHAnsi"/>
-          <w:b/>
-          <w:bCs/>
-          <w:sz w:val="28"/>
-          <w:szCs w:val="32"/>
-        </w:rPr>
-        <w:t>키우기</w:t>
-      </w:r>
-      <w:r>
-        <w:rPr>
-          <w:rFonts w:asciiTheme="majorHAnsi" w:eastAsiaTheme="majorHAnsi" w:hAnsiTheme="majorHAnsi" w:hint="eastAsia"/>
-          <w:b/>
-          <w:bCs/>
-          <w:sz w:val="28"/>
-          <w:szCs w:val="32"/>
-        </w:rPr>
         <w:t xml:space="preserve"> ]</w:t>
       </w:r>
-      <w:proofErr w:type="gramEnd"/>
     </w:p>
     <w:p>
       <w:pPr>
@@ -88,7 +64,6 @@
           <w:rFonts w:asciiTheme="minorHAnsi" w:eastAsiaTheme="minorHAnsi"/>
         </w:rPr>
       </w:pPr>
-      <w:proofErr w:type="spellStart"/>
       <w:r>
         <w:rPr>
           <w:rFonts w:asciiTheme="minorHAnsi" w:eastAsiaTheme="minorHAnsi"/>
@@ -97,7 +72,6 @@
         </w:rPr>
         <w:t>팀명</w:t>
       </w:r>
-      <w:proofErr w:type="spellEnd"/>
       <w:r>
         <w:rPr>
           <w:rFonts w:asciiTheme="minorHAnsi" w:eastAsiaTheme="minorHAnsi"/>
@@ -135,28 +109,12 @@
         </w:rPr>
         <w:t xml:space="preserve">: </w:t>
       </w:r>
-      <w:proofErr w:type="spellStart"/>
-      <w:r>
-        <w:rPr>
-          <w:rFonts w:asciiTheme="minorHAnsi" w:eastAsiaTheme="minorHAnsi" w:hint="eastAsia"/>
-        </w:rPr>
-        <w:t>유이레</w:t>
-      </w:r>
-      <w:proofErr w:type="spellEnd"/>
-      <w:r>
-        <w:rPr>
-          <w:rFonts w:asciiTheme="minorHAnsi" w:eastAsiaTheme="minorHAnsi" w:hint="eastAsia"/>
-        </w:rPr>
-        <w:t xml:space="preserve">, 이준규, 최승민, </w:t>
-      </w:r>
-      <w:proofErr w:type="spellStart"/>
-      <w:r>
-        <w:rPr>
-          <w:rFonts w:asciiTheme="minorHAnsi" w:eastAsiaTheme="minorHAnsi" w:hint="eastAsia"/>
-        </w:rPr>
-        <w:t>최연채</w:t>
-      </w:r>
-      <w:proofErr w:type="spellEnd"/>
+      <w:r>
+        <w:rPr>
+          <w:rFonts w:asciiTheme="minorHAnsi" w:eastAsiaTheme="minorHAnsi" w:hint="eastAsia"/>
+        </w:rPr>
+        <w:t>유이레, 이준규, 최승민, 최연채</w:t>
+      </w:r>
     </w:p>
     <w:p>
       <w:pPr>
@@ -168,23 +126,13 @@
           <w:rFonts w:asciiTheme="minorHAnsi" w:eastAsiaTheme="minorHAnsi"/>
         </w:rPr>
       </w:pPr>
-      <w:proofErr w:type="spellStart"/>
-      <w:r>
-        <w:rPr>
-          <w:rFonts w:asciiTheme="minorHAnsi" w:eastAsiaTheme="minorHAnsi" w:hint="eastAsia"/>
-          <w:b/>
-          <w:bCs/>
-        </w:rPr>
-        <w:t>깃허브</w:t>
-      </w:r>
-      <w:proofErr w:type="spellEnd"/>
-      <w:r>
-        <w:rPr>
-          <w:rFonts w:asciiTheme="minorHAnsi" w:eastAsiaTheme="minorHAnsi" w:hint="eastAsia"/>
-          <w:b/>
-          <w:bCs/>
-        </w:rPr>
-        <w:t xml:space="preserve"> </w:t>
+      <w:r>
+        <w:rPr>
+          <w:rFonts w:asciiTheme="minorHAnsi" w:eastAsiaTheme="minorHAnsi" w:hint="eastAsia"/>
+          <w:b/>
+          <w:bCs/>
+        </w:rPr>
+        <w:t xml:space="preserve">깃허브 </w:t>
       </w:r>
       <w:r>
         <w:rPr>
@@ -529,16 +477,8 @@
               <w:rPr>
                 <w:rFonts w:asciiTheme="minorHAnsi" w:eastAsiaTheme="minorHAnsi" w:hint="eastAsia"/>
               </w:rPr>
-              <w:t xml:space="preserve">- </w:t>
+              <w:t>- 다마고치</w:t>
             </w:r>
-            <w:proofErr w:type="spellStart"/>
-            <w:r>
-              <w:rPr>
-                <w:rFonts w:asciiTheme="minorHAnsi" w:eastAsiaTheme="minorHAnsi" w:hint="eastAsia"/>
-              </w:rPr>
-              <w:t>다마고치</w:t>
-            </w:r>
-            <w:proofErr w:type="spellEnd"/>
           </w:p>
           <w:p>
             <w:pPr>
@@ -977,23 +917,13 @@
           <w:rFonts w:asciiTheme="minorHAnsi" w:eastAsiaTheme="minorHAnsi"/>
         </w:rPr>
       </w:pPr>
-      <w:proofErr w:type="spellStart"/>
-      <w:r>
-        <w:rPr>
-          <w:rFonts w:asciiTheme="minorHAnsi" w:eastAsiaTheme="minorHAnsi"/>
-          <w:b/>
-          <w:bCs/>
-        </w:rPr>
-        <w:t>GameEntity</w:t>
-      </w:r>
-      <w:proofErr w:type="spellEnd"/>
-      <w:r>
-        <w:rPr>
-          <w:rFonts w:asciiTheme="minorHAnsi" w:eastAsiaTheme="minorHAnsi"/>
-          <w:b/>
-          <w:bCs/>
-        </w:rPr>
-        <w:t xml:space="preserve"> (새 객체 클래스)</w:t>
+      <w:r>
+        <w:rPr>
+          <w:rFonts w:asciiTheme="minorHAnsi" w:eastAsiaTheme="minorHAnsi"/>
+          <w:b/>
+          <w:bCs/>
+        </w:rPr>
+        <w:t>GameEntity (새 객체 클래스)</w:t>
       </w:r>
     </w:p>
     <w:p>
@@ -1064,16 +994,8 @@
         <w:rPr>
           <w:rFonts w:asciiTheme="minorHAnsi" w:eastAsiaTheme="minorHAnsi"/>
         </w:rPr>
-        <w:t xml:space="preserve">행동에 따른 수치 변화를 적용하고 범위를 제한하는 </w:t>
-      </w:r>
-      <w:proofErr w:type="spellStart"/>
-      <w:r>
-        <w:rPr>
-          <w:rFonts w:asciiTheme="minorHAnsi" w:eastAsiaTheme="minorHAnsi"/>
-        </w:rPr>
-        <w:t>update_stats</w:t>
-      </w:r>
-      <w:proofErr w:type="spellEnd"/>
+        <w:t>행동에 따른 수치 변화를 적용하고 범위를 제한하는 update_stats</w:t>
+      </w:r>
     </w:p>
     <w:p>
       <w:pPr>
@@ -1093,16 +1015,8 @@
         <w:rPr>
           <w:rFonts w:asciiTheme="minorHAnsi" w:eastAsiaTheme="minorHAnsi"/>
         </w:rPr>
-        <w:t xml:space="preserve">질병/반항/사망/도주 상태를 체크하는 </w:t>
-      </w:r>
-      <w:proofErr w:type="spellStart"/>
-      <w:r>
-        <w:rPr>
-          <w:rFonts w:asciiTheme="minorHAnsi" w:eastAsiaTheme="minorHAnsi"/>
-        </w:rPr>
-        <w:t>check_status</w:t>
-      </w:r>
-      <w:proofErr w:type="spellEnd"/>
+        <w:t>질병/반항/사망/도주 상태를 체크하는 check_status</w:t>
+      </w:r>
     </w:p>
     <w:p>
       <w:pPr>
@@ -1122,16 +1036,8 @@
         <w:rPr>
           <w:rFonts w:asciiTheme="minorHAnsi" w:eastAsiaTheme="minorHAnsi"/>
         </w:rPr>
-        <w:t xml:space="preserve">실시간 평균 만족도를 계산하는 </w:t>
-      </w:r>
-      <w:proofErr w:type="spellStart"/>
-      <w:r>
-        <w:rPr>
-          <w:rFonts w:asciiTheme="minorHAnsi" w:eastAsiaTheme="minorHAnsi"/>
-        </w:rPr>
-        <w:t>get_satisfaction</w:t>
-      </w:r>
-      <w:proofErr w:type="spellEnd"/>
+        <w:t>실시간 평균 만족도를 계산하는 get_satisfaction</w:t>
+      </w:r>
     </w:p>
     <w:p>
       <w:pPr>
@@ -1163,21 +1069,7 @@
         <w:rPr>
           <w:rFonts w:asciiTheme="minorHAnsi" w:eastAsiaTheme="minorHAnsi"/>
         </w:rPr>
-        <w:t xml:space="preserve">“방치하기”로 선택 시 </w:t>
-      </w:r>
-      <w:proofErr w:type="spellStart"/>
-      <w:r>
-        <w:rPr>
-          <w:rFonts w:asciiTheme="minorHAnsi" w:eastAsiaTheme="minorHAnsi"/>
-        </w:rPr>
-        <w:t>abandonedEgg</w:t>
-      </w:r>
-      <w:proofErr w:type="spellEnd"/>
-      <w:r>
-        <w:rPr>
-          <w:rFonts w:asciiTheme="minorHAnsi" w:eastAsiaTheme="minorHAnsi"/>
-        </w:rPr>
-        <w:t xml:space="preserve"> = true로 설정하여 화석 엔</w:t>
+        <w:t>“방치하기”로 선택 시 abandonedEgg = true로 설정하여 화석 엔</w:t>
       </w:r>
       <w:r>
         <w:rPr>
@@ -1185,33 +1077,11 @@
         </w:rPr>
         <w:t xml:space="preserve">딩 확인하는 </w:t>
       </w:r>
-      <w:proofErr w:type="spellStart"/>
-      <w:r>
-        <w:rPr>
-          <w:rFonts w:asciiTheme="minorHAnsi" w:eastAsiaTheme="minorHAnsi"/>
-        </w:rPr>
-        <w:t>recordEggAction</w:t>
-      </w:r>
-      <w:proofErr w:type="spellEnd"/>
-      <w:r>
-        <w:rPr>
-          <w:rFonts w:asciiTheme="minorHAnsi" w:eastAsiaTheme="minorHAnsi"/>
-        </w:rPr>
-        <w:t xml:space="preserve">(bool </w:t>
-      </w:r>
-      <w:proofErr w:type="spellStart"/>
-      <w:r>
-        <w:rPr>
-          <w:rFonts w:asciiTheme="minorHAnsi" w:eastAsiaTheme="minorHAnsi"/>
-        </w:rPr>
-        <w:t>isIgnore</w:t>
-      </w:r>
-      <w:proofErr w:type="spellEnd"/>
-      <w:r>
-        <w:rPr>
-          <w:rFonts w:asciiTheme="minorHAnsi" w:eastAsiaTheme="minorHAnsi"/>
-        </w:rPr>
-        <w:t>)</w:t>
+      <w:r>
+        <w:rPr>
+          <w:rFonts w:asciiTheme="minorHAnsi" w:eastAsiaTheme="minorHAnsi"/>
+        </w:rPr>
+        <w:t>recordEggAction(bool isIgnore)</w:t>
       </w:r>
     </w:p>
     <w:p>
@@ -1234,33 +1104,17 @@
         </w:rPr>
         <w:t xml:space="preserve">스트레스 50 이상 시 20% 확률로 반항 이벤트를 발동하여 스트레스 +10 </w:t>
       </w:r>
-      <w:proofErr w:type="spellStart"/>
-      <w:r>
-        <w:rPr>
-          <w:rFonts w:asciiTheme="minorHAnsi" w:eastAsiaTheme="minorHAnsi" w:hint="eastAsia"/>
-        </w:rPr>
-        <w:t>패널티</w:t>
-      </w:r>
-      <w:proofErr w:type="spellEnd"/>
-      <w:r>
-        <w:rPr>
-          <w:rFonts w:asciiTheme="minorHAnsi" w:eastAsiaTheme="minorHAnsi" w:hint="eastAsia"/>
-        </w:rPr>
-        <w:t xml:space="preserve"> 부여하는 </w:t>
-      </w:r>
-      <w:proofErr w:type="spellStart"/>
-      <w:r>
-        <w:rPr>
-          <w:rFonts w:asciiTheme="minorHAnsi" w:eastAsiaTheme="minorHAnsi"/>
-        </w:rPr>
-        <w:t>is_rebellious</w:t>
-      </w:r>
-      <w:proofErr w:type="spellEnd"/>
-      <w:r>
-        <w:rPr>
-          <w:rFonts w:asciiTheme="minorHAnsi" w:eastAsiaTheme="minorHAnsi"/>
-        </w:rPr>
-        <w:t>()</w:t>
+      <w:r>
+        <w:rPr>
+          <w:rFonts w:asciiTheme="minorHAnsi" w:eastAsiaTheme="minorHAnsi" w:hint="eastAsia"/>
+        </w:rPr>
+        <w:t xml:space="preserve">패널티 부여하는 </w:t>
+      </w:r>
+      <w:r>
+        <w:rPr>
+          <w:rFonts w:asciiTheme="minorHAnsi" w:eastAsiaTheme="minorHAnsi"/>
+        </w:rPr>
+        <w:t>is_rebellious()</w:t>
       </w:r>
     </w:p>
     <w:p>
@@ -1292,16 +1146,8 @@
         <w:rPr>
           <w:rFonts w:asciiTheme="minorHAnsi" w:eastAsiaTheme="minorHAnsi" w:hint="eastAsia"/>
         </w:rPr>
-        <w:t xml:space="preserve"> </w:t>
-      </w:r>
-      <w:proofErr w:type="spellStart"/>
-      <w:r>
-        <w:rPr>
-          <w:rFonts w:asciiTheme="minorHAnsi" w:eastAsiaTheme="minorHAnsi" w:hint="eastAsia"/>
-        </w:rPr>
-        <w:t>클램프</w:t>
-      </w:r>
-      <w:proofErr w:type="spellEnd"/>
+        <w:t xml:space="preserve"> 클램프</w:t>
+      </w:r>
     </w:p>
     <w:p>
       <w:pPr>
@@ -1440,16 +1286,8 @@
         <w:rPr>
           <w:rFonts w:asciiTheme="minorHAnsi" w:eastAsiaTheme="minorHAnsi"/>
         </w:rPr>
-        <w:t xml:space="preserve">전체 게임 루프를 관리하는 </w:t>
-      </w:r>
-      <w:proofErr w:type="spellStart"/>
-      <w:r>
-        <w:rPr>
-          <w:rFonts w:asciiTheme="minorHAnsi" w:eastAsiaTheme="minorHAnsi"/>
-        </w:rPr>
-        <w:t>run_game_loop</w:t>
-      </w:r>
-      <w:proofErr w:type="spellEnd"/>
+        <w:t>전체 게임 루프를 관리하는 run_game_loop</w:t>
+      </w:r>
     </w:p>
     <w:p>
       <w:pPr>
@@ -1469,30 +1307,8 @@
         <w:rPr>
           <w:rFonts w:asciiTheme="minorHAnsi" w:eastAsiaTheme="minorHAnsi"/>
         </w:rPr>
-        <w:t xml:space="preserve">플레이어 선택에 따른 결과값 출력 및 </w:t>
-      </w:r>
-      <w:proofErr w:type="spellStart"/>
-      <w:r>
-        <w:rPr>
-          <w:rFonts w:asciiTheme="minorHAnsi" w:eastAsiaTheme="minorHAnsi"/>
-        </w:rPr>
-        <w:t>스탯을</w:t>
-      </w:r>
-      <w:proofErr w:type="spellEnd"/>
-      <w:r>
-        <w:rPr>
-          <w:rFonts w:asciiTheme="minorHAnsi" w:eastAsiaTheme="minorHAnsi"/>
-        </w:rPr>
-        <w:t xml:space="preserve"> 반영하는 </w:t>
-      </w:r>
-      <w:proofErr w:type="spellStart"/>
-      <w:r>
-        <w:rPr>
-          <w:rFonts w:asciiTheme="minorHAnsi" w:eastAsiaTheme="minorHAnsi"/>
-        </w:rPr>
-        <w:t>process_action</w:t>
-      </w:r>
-      <w:proofErr w:type="spellEnd"/>
+        <w:t>플레이어 선택에 따른 결과값 출력 및 스탯을 반영하는 process_action</w:t>
+      </w:r>
     </w:p>
     <w:p>
       <w:pPr>
@@ -1512,16 +1328,8 @@
         <w:rPr>
           <w:rFonts w:asciiTheme="minorHAnsi" w:eastAsiaTheme="minorHAnsi"/>
         </w:rPr>
-        <w:t xml:space="preserve">행동 횟수 차감 및 시간/주차 변경 로직인 </w:t>
-      </w:r>
-      <w:proofErr w:type="spellStart"/>
-      <w:r>
-        <w:rPr>
-          <w:rFonts w:asciiTheme="minorHAnsi" w:eastAsiaTheme="minorHAnsi"/>
-        </w:rPr>
-        <w:t>next_turn</w:t>
-      </w:r>
-      <w:proofErr w:type="spellEnd"/>
+        <w:t>행동 횟수 차감 및 시간/주차 변경 로직인 next_turn</w:t>
+      </w:r>
     </w:p>
     <w:p>
       <w:pPr>
@@ -1549,42 +1357,12 @@
         </w:rPr>
         <w:t xml:space="preserve">적용하는 </w:t>
       </w:r>
-      <w:proofErr w:type="spellStart"/>
-      <w:r>
-        <w:rPr>
-          <w:rFonts w:asciiTheme="minorHAnsi" w:eastAsiaTheme="minorHAnsi"/>
-        </w:rPr>
-        <w:t>apply_weekly_passive</w:t>
-      </w:r>
-      <w:proofErr w:type="spellEnd"/>
-      <w:r>
-        <w:rPr>
-          <w:rFonts w:asciiTheme="minorHAnsi" w:eastAsiaTheme="minorHAnsi"/>
-        </w:rPr>
-        <w:t xml:space="preserve">와, </w:t>
-      </w:r>
-      <w:proofErr w:type="spellStart"/>
-      <w:r>
-        <w:rPr>
-          <w:rFonts w:asciiTheme="minorHAnsi" w:eastAsiaTheme="minorHAnsi"/>
-        </w:rPr>
-        <w:t>last_grown_week</w:t>
-      </w:r>
-      <w:proofErr w:type="spellEnd"/>
-      <w:r>
-        <w:rPr>
-          <w:rFonts w:asciiTheme="minorHAnsi" w:eastAsiaTheme="minorHAnsi"/>
-        </w:rPr>
-        <w:t xml:space="preserve">로 중복 성장을 방지하는 </w:t>
-      </w:r>
-      <w:proofErr w:type="spellStart"/>
-      <w:r>
-        <w:rPr>
-          <w:rFonts w:asciiTheme="minorHAnsi" w:eastAsiaTheme="minorHAnsi"/>
-        </w:rPr>
-        <w:t>check_growth</w:t>
-      </w:r>
-      <w:proofErr w:type="spellEnd"/>
+      <w:r>
+        <w:rPr>
+          <w:rFonts w:asciiTheme="minorHAnsi" w:eastAsiaTheme="minorHAnsi"/>
+        </w:rPr>
+        <w:t>apply_weekly_passive와, last_grown_week로 중복 성장을 방지하는 check_growth</w:t>
+      </w:r>
     </w:p>
     <w:p>
       <w:pPr>
@@ -1623,23 +1401,13 @@
           <w:rFonts w:asciiTheme="minorHAnsi" w:eastAsiaTheme="minorHAnsi"/>
         </w:rPr>
       </w:pPr>
-      <w:proofErr w:type="spellStart"/>
-      <w:r>
-        <w:rPr>
-          <w:rFonts w:asciiTheme="minorHAnsi" w:eastAsiaTheme="minorHAnsi"/>
-          <w:b/>
-          <w:bCs/>
-        </w:rPr>
-        <w:t>ActionManager</w:t>
-      </w:r>
-      <w:proofErr w:type="spellEnd"/>
-      <w:r>
-        <w:rPr>
-          <w:rFonts w:asciiTheme="minorHAnsi" w:eastAsiaTheme="minorHAnsi"/>
-          <w:b/>
-          <w:bCs/>
-        </w:rPr>
-        <w:t xml:space="preserve"> (행동 및 선택지 클래스)</w:t>
+      <w:r>
+        <w:rPr>
+          <w:rFonts w:asciiTheme="minorHAnsi" w:eastAsiaTheme="minorHAnsi"/>
+          <w:b/>
+          <w:bCs/>
+        </w:rPr>
+        <w:t>ActionManager (행동 및 선택지 클래스)</w:t>
       </w:r>
     </w:p>
     <w:p>
@@ -1676,21 +1444,7 @@
         <w:rPr>
           <w:rFonts w:asciiTheme="minorHAnsi" w:eastAsiaTheme="minorHAnsi"/>
         </w:rPr>
-        <w:t xml:space="preserve">, 선택지별 수치 </w:t>
-      </w:r>
-      <w:proofErr w:type="spellStart"/>
-      <w:r>
-        <w:rPr>
-          <w:rFonts w:asciiTheme="minorHAnsi" w:eastAsiaTheme="minorHAnsi"/>
-        </w:rPr>
-        <w:t>변화값</w:t>
-      </w:r>
-      <w:proofErr w:type="spellEnd"/>
-      <w:r>
-        <w:rPr>
-          <w:rFonts w:asciiTheme="minorHAnsi" w:eastAsiaTheme="minorHAnsi"/>
-        </w:rPr>
-        <w:t xml:space="preserve"> 테이블</w:t>
+        <w:t>, 선택지별 수치 변화값 테이블</w:t>
       </w:r>
     </w:p>
     <w:p>
@@ -1736,16 +1490,8 @@
         <w:rPr>
           <w:rFonts w:asciiTheme="minorHAnsi" w:eastAsiaTheme="minorHAnsi"/>
         </w:rPr>
-        <w:t xml:space="preserve">현재 성장 단계에 맞는 메뉴를 반환하는 </w:t>
-      </w:r>
-      <w:proofErr w:type="spellStart"/>
-      <w:r>
-        <w:rPr>
-          <w:rFonts w:asciiTheme="minorHAnsi" w:eastAsiaTheme="minorHAnsi"/>
-        </w:rPr>
-        <w:t>get_available_actions</w:t>
-      </w:r>
-      <w:proofErr w:type="spellEnd"/>
+        <w:t>현재 성장 단계에 맞는 메뉴를 반환하는 get_available_actions</w:t>
+      </w:r>
     </w:p>
     <w:p>
       <w:pPr>
@@ -1765,16 +1511,8 @@
         <w:rPr>
           <w:rFonts w:asciiTheme="minorHAnsi" w:eastAsiaTheme="minorHAnsi"/>
         </w:rPr>
-        <w:t xml:space="preserve">훈련이나 먹이 급여 시 확률적으로 발생하는 아이템 효과를 처리하는 </w:t>
-      </w:r>
-      <w:proofErr w:type="spellStart"/>
-      <w:r>
-        <w:rPr>
-          <w:rFonts w:asciiTheme="minorHAnsi" w:eastAsiaTheme="minorHAnsi"/>
-        </w:rPr>
-        <w:t>try_get_item</w:t>
-      </w:r>
-      <w:proofErr w:type="spellEnd"/>
+        <w:t>훈련이나 먹이 급여 시 확률적으로 발생하는 아이템 효과를 처리하는 try_get_item</w:t>
+      </w:r>
       <w:r>
         <w:rPr>
           <w:rFonts w:asciiTheme="minorHAnsi" w:eastAsiaTheme="minorHAnsi" w:hint="eastAsia"/>
@@ -1818,21 +1556,7 @@
         <w:rPr>
           <w:rFonts w:asciiTheme="minorHAnsi" w:eastAsiaTheme="minorHAnsi"/>
         </w:rPr>
-        <w:t xml:space="preserve">아이템 보유 여부에 따라 먹이 선택지를 동적으로 필터링하는 </w:t>
-      </w:r>
-      <w:proofErr w:type="spellStart"/>
-      <w:r>
-        <w:rPr>
-          <w:rFonts w:asciiTheme="minorHAnsi" w:eastAsiaTheme="minorHAnsi"/>
-        </w:rPr>
-        <w:t>get_sub_actions</w:t>
-      </w:r>
-      <w:proofErr w:type="spellEnd"/>
-      <w:r>
-        <w:rPr>
-          <w:rFonts w:asciiTheme="minorHAnsi" w:eastAsiaTheme="minorHAnsi"/>
-        </w:rPr>
-        <w:t xml:space="preserve"> 포함</w:t>
+        <w:t>아이템 보유 여부에 따라 먹이 선택지를 동적으로 필터링하는 get_sub_actions 포함</w:t>
       </w:r>
     </w:p>
     <w:p>
@@ -1872,23 +1596,13 @@
           <w:rFonts w:asciiTheme="minorHAnsi" w:eastAsiaTheme="minorHAnsi"/>
         </w:rPr>
       </w:pPr>
-      <w:proofErr w:type="spellStart"/>
-      <w:r>
-        <w:rPr>
-          <w:rFonts w:asciiTheme="minorHAnsi" w:eastAsiaTheme="minorHAnsi"/>
-          <w:b/>
-          <w:bCs/>
-        </w:rPr>
-        <w:t>UIRenderer</w:t>
-      </w:r>
-      <w:proofErr w:type="spellEnd"/>
-      <w:r>
-        <w:rPr>
-          <w:rFonts w:asciiTheme="minorHAnsi" w:eastAsiaTheme="minorHAnsi"/>
-          <w:b/>
-          <w:bCs/>
-        </w:rPr>
-        <w:t xml:space="preserve"> (화면 출력 클래스)</w:t>
+      <w:r>
+        <w:rPr>
+          <w:rFonts w:asciiTheme="minorHAnsi" w:eastAsiaTheme="minorHAnsi"/>
+          <w:b/>
+          <w:bCs/>
+        </w:rPr>
+        <w:t>UIRenderer (화면 출력 클래스)</w:t>
       </w:r>
     </w:p>
     <w:p>
@@ -1934,16 +1648,8 @@
         <w:rPr>
           <w:rFonts w:asciiTheme="minorHAnsi" w:eastAsiaTheme="minorHAnsi"/>
         </w:rPr>
-        <w:t xml:space="preserve">현재 주차와 상태 정보를 상시 노출하는 </w:t>
-      </w:r>
-      <w:proofErr w:type="spellStart"/>
-      <w:r>
-        <w:rPr>
-          <w:rFonts w:asciiTheme="minorHAnsi" w:eastAsiaTheme="minorHAnsi"/>
-        </w:rPr>
-        <w:t>display_status</w:t>
-      </w:r>
-      <w:proofErr w:type="spellEnd"/>
+        <w:t>현재 주차와 상태 정보를 상시 노출하는 display_status</w:t>
+      </w:r>
     </w:p>
     <w:p>
       <w:pPr>
@@ -1963,16 +1669,8 @@
         <w:rPr>
           <w:rFonts w:asciiTheme="minorHAnsi" w:eastAsiaTheme="minorHAnsi"/>
         </w:rPr>
-        <w:t xml:space="preserve">단계별 외형 변화를 아스키 아트로 출력하는 </w:t>
-      </w:r>
-      <w:proofErr w:type="spellStart"/>
-      <w:r>
-        <w:rPr>
-          <w:rFonts w:asciiTheme="minorHAnsi" w:eastAsiaTheme="minorHAnsi"/>
-        </w:rPr>
-        <w:t>draw_bird</w:t>
-      </w:r>
-      <w:proofErr w:type="spellEnd"/>
+        <w:t>단계별 외형 변화를 아스키 아트로 출력하는 draw_bird</w:t>
+      </w:r>
     </w:p>
     <w:p>
       <w:pPr>
@@ -1992,16 +1690,8 @@
         <w:rPr>
           <w:rFonts w:asciiTheme="minorHAnsi" w:eastAsiaTheme="minorHAnsi"/>
         </w:rPr>
-        <w:t xml:space="preserve">조건에 따른 엔딩을 묘사하고 출력하는 </w:t>
-      </w:r>
-      <w:proofErr w:type="spellStart"/>
-      <w:r>
-        <w:rPr>
-          <w:rFonts w:asciiTheme="minorHAnsi" w:eastAsiaTheme="minorHAnsi"/>
-        </w:rPr>
-        <w:t>show_ending</w:t>
-      </w:r>
-      <w:proofErr w:type="spellEnd"/>
+        <w:t>조건에 따른 엔딩을 묘사하고 출력하는 show_ending</w:t>
+      </w:r>
     </w:p>
     <w:p>
       <w:pPr>
@@ -2013,7 +1703,6 @@
           <w:rFonts w:asciiTheme="minorHAnsi" w:eastAsiaTheme="minorHAnsi"/>
         </w:rPr>
       </w:pPr>
-      <w:proofErr w:type="spellStart"/>
       <w:r>
         <w:rPr>
           <w:rFonts w:asciiTheme="minorHAnsi" w:eastAsiaTheme="minorHAnsi"/>
@@ -2021,16 +1710,7 @@
           <w:bCs/>
         </w:rPr>
         <w:lastRenderedPageBreak/>
-        <w:t>GameManager</w:t>
-      </w:r>
-      <w:proofErr w:type="spellEnd"/>
-      <w:r>
-        <w:rPr>
-          <w:rFonts w:asciiTheme="minorHAnsi" w:eastAsiaTheme="minorHAnsi"/>
-          <w:b/>
-          <w:bCs/>
-        </w:rPr>
-        <w:t xml:space="preserve"> (게임 통합 관리 클래스)</w:t>
+        <w:t>GameManager (게임 통합 관리 클래스)</w:t>
       </w:r>
     </w:p>
     <w:p>
@@ -2063,63 +1743,7 @@
         <w:rPr>
           <w:rFonts w:asciiTheme="minorHAnsi" w:eastAsiaTheme="minorHAnsi"/>
         </w:rPr>
-        <w:t xml:space="preserve">: </w:t>
-      </w:r>
-      <w:proofErr w:type="spellStart"/>
-      <w:r>
-        <w:rPr>
-          <w:rFonts w:asciiTheme="minorHAnsi" w:eastAsiaTheme="minorHAnsi"/>
-        </w:rPr>
-        <w:t>GameEntity</w:t>
-      </w:r>
-      <w:proofErr w:type="spellEnd"/>
-      <w:r>
-        <w:rPr>
-          <w:rFonts w:asciiTheme="minorHAnsi" w:eastAsiaTheme="minorHAnsi"/>
-        </w:rPr>
-        <w:t xml:space="preserve">, </w:t>
-      </w:r>
-      <w:proofErr w:type="spellStart"/>
-      <w:r>
-        <w:rPr>
-          <w:rFonts w:asciiTheme="minorHAnsi" w:eastAsiaTheme="minorHAnsi"/>
-        </w:rPr>
-        <w:t>GameEngine</w:t>
-      </w:r>
-      <w:proofErr w:type="spellEnd"/>
-      <w:r>
-        <w:rPr>
-          <w:rFonts w:asciiTheme="minorHAnsi" w:eastAsiaTheme="minorHAnsi"/>
-        </w:rPr>
-        <w:t xml:space="preserve">, </w:t>
-      </w:r>
-      <w:proofErr w:type="spellStart"/>
-      <w:r>
-        <w:rPr>
-          <w:rFonts w:asciiTheme="minorHAnsi" w:eastAsiaTheme="minorHAnsi"/>
-        </w:rPr>
-        <w:t>ActionManager</w:t>
-      </w:r>
-      <w:proofErr w:type="spellEnd"/>
-      <w:r>
-        <w:rPr>
-          <w:rFonts w:asciiTheme="minorHAnsi" w:eastAsiaTheme="minorHAnsi"/>
-        </w:rPr>
-        <w:t xml:space="preserve">, </w:t>
-      </w:r>
-      <w:proofErr w:type="spellStart"/>
-      <w:r>
-        <w:rPr>
-          <w:rFonts w:asciiTheme="minorHAnsi" w:eastAsiaTheme="minorHAnsi"/>
-        </w:rPr>
-        <w:t>UIRenderer</w:t>
-      </w:r>
-      <w:proofErr w:type="spellEnd"/>
-      <w:r>
-        <w:rPr>
-          <w:rFonts w:asciiTheme="minorHAnsi" w:eastAsiaTheme="minorHAnsi"/>
-        </w:rPr>
-        <w:t xml:space="preserve"> </w:t>
+        <w:t xml:space="preserve">: GameEntity, GameEngine, ActionManager, UIRenderer </w:t>
       </w:r>
       <w:r>
         <w:rPr>
@@ -2177,16 +1801,8 @@
         <w:rPr>
           <w:rFonts w:asciiTheme="minorHAnsi" w:eastAsiaTheme="minorHAnsi"/>
         </w:rPr>
-        <w:t xml:space="preserve">길에서 알을 줍는 시작 스토리 및 이름 설정 등 게임 초기화 로직을 수행하는 </w:t>
-      </w:r>
-      <w:proofErr w:type="spellStart"/>
-      <w:r>
-        <w:rPr>
-          <w:rFonts w:asciiTheme="minorHAnsi" w:eastAsiaTheme="minorHAnsi"/>
-        </w:rPr>
-        <w:t>initializeGame</w:t>
-      </w:r>
-      <w:proofErr w:type="spellEnd"/>
+        <w:t>길에서 알을 줍는 시작 스토리 및 이름 설정 등 게임 초기화 로직을 수행하는 initializeGame</w:t>
+      </w:r>
     </w:p>
     <w:p>
       <w:pPr>
@@ -2206,63 +1822,7 @@
         <w:rPr>
           <w:rFonts w:asciiTheme="minorHAnsi" w:eastAsiaTheme="minorHAnsi"/>
         </w:rPr>
-        <w:t xml:space="preserve">게임 전체 루프를 실행하고 종료 처리를 관리하는 run. </w:t>
-      </w:r>
-      <w:proofErr w:type="spellStart"/>
-      <w:r>
-        <w:rPr>
-          <w:rFonts w:asciiTheme="minorHAnsi" w:eastAsiaTheme="minorHAnsi"/>
-        </w:rPr>
-        <w:t>calcStageInt</w:t>
-      </w:r>
-      <w:proofErr w:type="spellEnd"/>
-      <w:r>
-        <w:rPr>
-          <w:rFonts w:asciiTheme="minorHAnsi" w:eastAsiaTheme="minorHAnsi"/>
-        </w:rPr>
-        <w:t>(</w:t>
-      </w:r>
-      <w:proofErr w:type="gramStart"/>
-      <w:r>
-        <w:rPr>
-          <w:rFonts w:asciiTheme="minorHAnsi" w:eastAsiaTheme="minorHAnsi"/>
-        </w:rPr>
-        <w:t>) /</w:t>
-      </w:r>
-      <w:proofErr w:type="gramEnd"/>
-      <w:r>
-        <w:rPr>
-          <w:rFonts w:asciiTheme="minorHAnsi" w:eastAsiaTheme="minorHAnsi"/>
-        </w:rPr>
-        <w:t xml:space="preserve"> </w:t>
-      </w:r>
-      <w:proofErr w:type="spellStart"/>
-      <w:r>
-        <w:rPr>
-          <w:rFonts w:asciiTheme="minorHAnsi" w:eastAsiaTheme="minorHAnsi"/>
-        </w:rPr>
-        <w:t>calcStageName</w:t>
-      </w:r>
-      <w:proofErr w:type="spellEnd"/>
-      <w:r>
-        <w:rPr>
-          <w:rFonts w:asciiTheme="minorHAnsi" w:eastAsiaTheme="minorHAnsi"/>
-        </w:rPr>
-        <w:t xml:space="preserve">()은 현재 주차를 기반으로 성장 단계를 계산하여 </w:t>
-      </w:r>
-      <w:proofErr w:type="spellStart"/>
-      <w:r>
-        <w:rPr>
-          <w:rFonts w:asciiTheme="minorHAnsi" w:eastAsiaTheme="minorHAnsi"/>
-        </w:rPr>
-        <w:t>GrowthStage</w:t>
-      </w:r>
-      <w:proofErr w:type="spellEnd"/>
-      <w:r>
-        <w:rPr>
-          <w:rFonts w:asciiTheme="minorHAnsi" w:eastAsiaTheme="minorHAnsi"/>
-        </w:rPr>
-        <w:t xml:space="preserve"> getter 없이 주차 값만으로 단계를 판별</w:t>
+        <w:t>게임 전체 루프를 실행하고 종료 처리를 관리하는 run. calcStageInt() / calcStageName()은 현재 주차를 기반으로 성장 단계를 계산하여 GrowthStage getter 없이 주차 값만으로 단계를 판별</w:t>
       </w:r>
     </w:p>
     <w:p>
@@ -2279,19 +1839,11 @@
         </w:rPr>
         <w:t>-</w:t>
       </w:r>
-      <w:proofErr w:type="spellStart"/>
-      <w:r>
-        <w:rPr>
-          <w:rFonts w:asciiTheme="minorHAnsi" w:eastAsiaTheme="minorHAnsi"/>
-        </w:rPr>
-        <w:t>processTurn</w:t>
-      </w:r>
-      <w:proofErr w:type="spellEnd"/>
-      <w:r>
-        <w:rPr>
-          <w:rFonts w:asciiTheme="minorHAnsi" w:eastAsiaTheme="minorHAnsi"/>
-        </w:rPr>
-        <w:t>()은 UI 출력 → 메인 행동 선택 → 서브 행동 선택 → 수치 반영 → 반항 체크 → 아이템 처리 → 결과 출력의 순서로 진행</w:t>
+      <w:r>
+        <w:rPr>
+          <w:rFonts w:asciiTheme="minorHAnsi" w:eastAsiaTheme="minorHAnsi"/>
+        </w:rPr>
+        <w:t>processTurn()은 UI 출력 → 메인 행동 선택 → 서브 행동 선택 → 수치 반영 → 반항 체크 → 아이템 처리 → 결과 출력의 순서로 진행</w:t>
       </w:r>
     </w:p>
     <w:p>
@@ -2362,23 +1914,13 @@
           <w:bCs/>
         </w:rPr>
       </w:pPr>
-      <w:proofErr w:type="spellStart"/>
-      <w:r>
-        <w:rPr>
-          <w:rFonts w:asciiTheme="minorHAnsi" w:eastAsiaTheme="minorHAnsi"/>
-          <w:b/>
-          <w:bCs/>
-        </w:rPr>
-        <w:t>BirdRaise</w:t>
-      </w:r>
-      <w:proofErr w:type="spellEnd"/>
-      <w:r>
-        <w:rPr>
-          <w:rFonts w:asciiTheme="minorHAnsi" w:eastAsiaTheme="minorHAnsi"/>
-          <w:b/>
-          <w:bCs/>
-        </w:rPr>
-        <w:t>/</w:t>
+      <w:r>
+        <w:rPr>
+          <w:rFonts w:asciiTheme="minorHAnsi" w:eastAsiaTheme="minorHAnsi"/>
+          <w:b/>
+          <w:bCs/>
+        </w:rPr>
+        <w:t>BirdRaise/</w:t>
       </w:r>
     </w:p>
     <w:p>
@@ -2404,25 +1946,49 @@
           <w:b/>
           <w:bCs/>
         </w:rPr>
+        <w:t xml:space="preserve"> src/</w:t>
+      </w:r>
+    </w:p>
+    <w:p>
+      <w:pPr>
+        <w:spacing w:line="180" w:lineRule="auto"/>
+        <w:rPr>
+          <w:rFonts w:asciiTheme="minorHAnsi" w:eastAsiaTheme="minorHAnsi"/>
+          <w:b/>
+          <w:bCs/>
+        </w:rPr>
+      </w:pPr>
+      <w:r>
+        <w:rPr>
+          <w:rFonts w:asciiTheme="minorHAnsi" w:eastAsiaTheme="minorHAnsi" w:hint="eastAsia"/>
+          <w:b/>
+          <w:bCs/>
+        </w:rPr>
+        <w:t>│</w:t>
+      </w:r>
+      <w:r>
+        <w:rPr>
+          <w:rFonts w:asciiTheme="minorHAnsi" w:eastAsiaTheme="minorHAnsi"/>
+          <w:b/>
+          <w:bCs/>
+        </w:rPr>
+        <w:t xml:space="preserve">   ├── Main.cpp           </w:t>
+      </w:r>
+      <w:r>
+        <w:rPr>
+          <w:rFonts w:asciiTheme="minorHAnsi" w:eastAsiaTheme="minorHAnsi" w:hint="eastAsia"/>
+          <w:b/>
+          <w:bCs/>
+        </w:rPr>
         <w:t xml:space="preserve"> </w:t>
       </w:r>
-      <w:proofErr w:type="spellStart"/>
-      <w:r>
-        <w:rPr>
-          <w:rFonts w:asciiTheme="minorHAnsi" w:eastAsiaTheme="minorHAnsi"/>
-          <w:b/>
-          <w:bCs/>
-        </w:rPr>
-        <w:t>src</w:t>
-      </w:r>
-      <w:proofErr w:type="spellEnd"/>
-      <w:r>
-        <w:rPr>
-          <w:rFonts w:asciiTheme="minorHAnsi" w:eastAsiaTheme="minorHAnsi"/>
-          <w:b/>
-          <w:bCs/>
-        </w:rPr>
-        <w:t>/</w:t>
+      <w:r>
+        <w:rPr>
+          <w:rFonts w:asciiTheme="minorHAnsi" w:eastAsiaTheme="minorHAnsi"/>
+          <w:b/>
+          <w:bCs/>
+        </w:rPr>
+        <w:t># 진입점, 콘솔 UTF-8 인코딩 설정</w:t>
       </w:r>
     </w:p>
     <w:p>
@@ -2448,7 +2014,33 @@
           <w:b/>
           <w:bCs/>
         </w:rPr>
-        <w:t xml:space="preserve">   ├── Main.cpp           </w:t>
+        <w:t xml:space="preserve">   ├── GameManager.cpp   # 게임 전체 흐름 관리 (턴 진행, 행동 선택, 엔딩)</w:t>
+      </w:r>
+    </w:p>
+    <w:p>
+      <w:pPr>
+        <w:spacing w:line="180" w:lineRule="auto"/>
+        <w:rPr>
+          <w:rFonts w:asciiTheme="minorHAnsi" w:eastAsiaTheme="minorHAnsi"/>
+          <w:b/>
+          <w:bCs/>
+        </w:rPr>
+      </w:pPr>
+      <w:r>
+        <w:rPr>
+          <w:rFonts w:asciiTheme="minorHAnsi" w:eastAsiaTheme="minorHAnsi" w:hint="eastAsia"/>
+          <w:b/>
+          <w:bCs/>
+        </w:rPr>
+        <w:t>│</w:t>
+      </w:r>
+      <w:r>
+        <w:rPr>
+          <w:rFonts w:asciiTheme="minorHAnsi" w:eastAsiaTheme="minorHAnsi"/>
+          <w:b/>
+          <w:bCs/>
+        </w:rPr>
+        <w:t xml:space="preserve">   ├── GameEntity.cpp     </w:t>
       </w:r>
       <w:r>
         <w:rPr>
@@ -2464,25 +2056,7 @@
           <w:b/>
           <w:bCs/>
         </w:rPr>
-        <w:t xml:space="preserve"># </w:t>
-      </w:r>
-      <w:proofErr w:type="spellStart"/>
-      <w:r>
-        <w:rPr>
-          <w:rFonts w:asciiTheme="minorHAnsi" w:eastAsiaTheme="minorHAnsi"/>
-          <w:b/>
-          <w:bCs/>
-        </w:rPr>
-        <w:t>진입점</w:t>
-      </w:r>
-      <w:proofErr w:type="spellEnd"/>
-      <w:r>
-        <w:rPr>
-          <w:rFonts w:asciiTheme="minorHAnsi" w:eastAsiaTheme="minorHAnsi"/>
-          <w:b/>
-          <w:bCs/>
-        </w:rPr>
-        <w:t>, 콘솔 UTF-8 인코딩 설정</w:t>
+        <w:t># 새 객체 상태 관리 (수치, 성장 단계, 생존 여부)</w:t>
       </w:r>
     </w:p>
     <w:p>
@@ -2508,7 +2082,7 @@
           <w:b/>
           <w:bCs/>
         </w:rPr>
-        <w:t xml:space="preserve">   ├── GameManager.cpp   # 게임 전체 흐름 관리 (턴 진행, 행동 선택, 엔딩)</w:t>
+        <w:t xml:space="preserve">   ├── ActionManager.cpp  # 행동 목록, 세부 선택지, 아이템/인벤토리 처리</w:t>
       </w:r>
     </w:p>
     <w:p>
@@ -2534,7 +2108,7 @@
           <w:b/>
           <w:bCs/>
         </w:rPr>
-        <w:t xml:space="preserve">   ├── GameEntity.cpp     </w:t>
+        <w:t xml:space="preserve">   ├── Time.cpp           </w:t>
       </w:r>
       <w:r>
         <w:rPr>
@@ -2550,7 +2124,7 @@
           <w:b/>
           <w:bCs/>
         </w:rPr>
-        <w:t># 새 객체 상태 관리 (수치, 성장 단계, 생존 여부)</w:t>
+        <w:t># 주차 및 행동 횟수 관리, 성장 단계 전환</w:t>
       </w:r>
     </w:p>
     <w:p>
@@ -2576,25 +2150,23 @@
           <w:b/>
           <w:bCs/>
         </w:rPr>
-        <w:t xml:space="preserve">   ├── </w:t>
-      </w:r>
-      <w:proofErr w:type="gramStart"/>
-      <w:r>
-        <w:rPr>
-          <w:rFonts w:asciiTheme="minorHAnsi" w:eastAsiaTheme="minorHAnsi"/>
-          <w:b/>
-          <w:bCs/>
-        </w:rPr>
-        <w:t>ActionManager.cpp  #</w:t>
-      </w:r>
-      <w:proofErr w:type="gramEnd"/>
-      <w:r>
-        <w:rPr>
-          <w:rFonts w:asciiTheme="minorHAnsi" w:eastAsiaTheme="minorHAnsi"/>
-          <w:b/>
-          <w:bCs/>
-        </w:rPr>
-        <w:t xml:space="preserve"> 행동 목록, 세부 선택지, 아이템/인벤토리 처리</w:t>
+        <w:t xml:space="preserve">   └── UIRenderer.cpp    </w:t>
+      </w:r>
+      <w:r>
+        <w:rPr>
+          <w:rFonts w:asciiTheme="minorHAnsi" w:eastAsiaTheme="minorHAnsi" w:hint="eastAsia"/>
+          <w:b/>
+          <w:bCs/>
+        </w:rPr>
+        <w:t xml:space="preserve"> </w:t>
+      </w:r>
+      <w:r>
+        <w:rPr>
+          <w:rFonts w:asciiTheme="minorHAnsi" w:eastAsiaTheme="minorHAnsi"/>
+          <w:b/>
+          <w:bCs/>
+        </w:rPr>
+        <w:t xml:space="preserve"> # 콘솔 화면 출력 (게이지, 아트, 엔딩)</w:t>
       </w:r>
     </w:p>
     <w:p>
@@ -2612,31 +2184,15 @@
           <w:b/>
           <w:bCs/>
         </w:rPr>
-        <w:t>│</w:t>
-      </w:r>
-      <w:r>
-        <w:rPr>
-          <w:rFonts w:asciiTheme="minorHAnsi" w:eastAsiaTheme="minorHAnsi"/>
-          <w:b/>
-          <w:bCs/>
-        </w:rPr>
-        <w:t xml:space="preserve">   ├── Time.cpp           </w:t>
-      </w:r>
-      <w:r>
-        <w:rPr>
-          <w:rFonts w:asciiTheme="minorHAnsi" w:eastAsiaTheme="minorHAnsi" w:hint="eastAsia"/>
-          <w:b/>
-          <w:bCs/>
-        </w:rPr>
-        <w:t xml:space="preserve"> </w:t>
-      </w:r>
-      <w:r>
-        <w:rPr>
-          <w:rFonts w:asciiTheme="minorHAnsi" w:eastAsiaTheme="minorHAnsi"/>
-          <w:b/>
-          <w:bCs/>
-        </w:rPr>
-        <w:t># 주차 및 행동 횟수 관리, 성장 단계 전환</w:t>
+        <w:t>└──</w:t>
+      </w:r>
+      <w:r>
+        <w:rPr>
+          <w:rFonts w:asciiTheme="minorHAnsi" w:eastAsiaTheme="minorHAnsi"/>
+          <w:b/>
+          <w:bCs/>
+        </w:rPr>
+        <w:t xml:space="preserve"> include/</w:t>
       </w:r>
     </w:p>
     <w:p>
@@ -2650,35 +2206,11 @@
       </w:pPr>
       <w:r>
         <w:rPr>
-          <w:rFonts w:asciiTheme="minorHAnsi" w:eastAsiaTheme="minorHAnsi" w:hint="eastAsia"/>
-          <w:b/>
-          <w:bCs/>
-        </w:rPr>
-        <w:t>│</w:t>
-      </w:r>
-      <w:r>
-        <w:rPr>
-          <w:rFonts w:asciiTheme="minorHAnsi" w:eastAsiaTheme="minorHAnsi"/>
-          <w:b/>
-          <w:bCs/>
-        </w:rPr>
-        <w:t xml:space="preserve">   └── UIRenderer.cpp    </w:t>
-      </w:r>
-      <w:r>
-        <w:rPr>
-          <w:rFonts w:asciiTheme="minorHAnsi" w:eastAsiaTheme="minorHAnsi" w:hint="eastAsia"/>
-          <w:b/>
-          <w:bCs/>
-        </w:rPr>
-        <w:t xml:space="preserve"> </w:t>
-      </w:r>
-      <w:r>
-        <w:rPr>
-          <w:rFonts w:asciiTheme="minorHAnsi" w:eastAsiaTheme="minorHAnsi"/>
-          <w:b/>
-          <w:bCs/>
-        </w:rPr>
-        <w:t xml:space="preserve"> # 콘솔 화면 출력 (게이지, 아트, 엔딩)</w:t>
+          <w:rFonts w:asciiTheme="minorHAnsi" w:eastAsiaTheme="minorHAnsi"/>
+          <w:b/>
+          <w:bCs/>
+        </w:rPr>
+        <w:t xml:space="preserve">    ├── Time.h / GameManager.h / GameEntity.h</w:t>
       </w:r>
     </w:p>
     <w:p>
@@ -2692,6 +2224,14 @@
       </w:pPr>
       <w:r>
         <w:rPr>
+          <w:rFonts w:asciiTheme="minorHAnsi" w:eastAsiaTheme="minorHAnsi"/>
+          <w:b/>
+          <w:bCs/>
+        </w:rPr>
+        <w:t xml:space="preserve">    </w:t>
+      </w:r>
+      <w:r>
+        <w:rPr>
           <w:rFonts w:asciiTheme="minorHAnsi" w:eastAsiaTheme="minorHAnsi" w:hint="eastAsia"/>
           <w:b/>
           <w:bCs/>
@@ -2704,144 +2244,8 @@
           <w:b/>
           <w:bCs/>
         </w:rPr>
-        <w:t xml:space="preserve"> include/</w:t>
-      </w:r>
-    </w:p>
-    <w:p>
-      <w:pPr>
-        <w:spacing w:line="180" w:lineRule="auto"/>
-        <w:rPr>
-          <w:rFonts w:asciiTheme="minorHAnsi" w:eastAsiaTheme="minorHAnsi"/>
-          <w:b/>
-          <w:bCs/>
-        </w:rPr>
-      </w:pPr>
-      <w:r>
-        <w:rPr>
-          <w:rFonts w:asciiTheme="minorHAnsi" w:eastAsiaTheme="minorHAnsi"/>
-          <w:b/>
-          <w:bCs/>
-        </w:rPr>
-        <w:t xml:space="preserve">    ├── </w:t>
-      </w:r>
-      <w:proofErr w:type="spellStart"/>
-      <w:r>
-        <w:rPr>
-          <w:rFonts w:asciiTheme="minorHAnsi" w:eastAsiaTheme="minorHAnsi"/>
-          <w:b/>
-          <w:bCs/>
-        </w:rPr>
-        <w:t>Time.h</w:t>
-      </w:r>
-      <w:proofErr w:type="spellEnd"/>
-      <w:r>
-        <w:rPr>
-          <w:rFonts w:asciiTheme="minorHAnsi" w:eastAsiaTheme="minorHAnsi"/>
-          <w:b/>
-          <w:bCs/>
-        </w:rPr>
-        <w:t xml:space="preserve"> / </w:t>
-      </w:r>
-      <w:proofErr w:type="spellStart"/>
-      <w:r>
-        <w:rPr>
-          <w:rFonts w:asciiTheme="minorHAnsi" w:eastAsiaTheme="minorHAnsi"/>
-          <w:b/>
-          <w:bCs/>
-        </w:rPr>
-        <w:t>GameManager.h</w:t>
-      </w:r>
-      <w:proofErr w:type="spellEnd"/>
-      <w:r>
-        <w:rPr>
-          <w:rFonts w:asciiTheme="minorHAnsi" w:eastAsiaTheme="minorHAnsi"/>
-          <w:b/>
-          <w:bCs/>
-        </w:rPr>
-        <w:t xml:space="preserve"> / </w:t>
-      </w:r>
-      <w:proofErr w:type="spellStart"/>
-      <w:r>
-        <w:rPr>
-          <w:rFonts w:asciiTheme="minorHAnsi" w:eastAsiaTheme="minorHAnsi"/>
-          <w:b/>
-          <w:bCs/>
-        </w:rPr>
-        <w:t>GameEntity.h</w:t>
-      </w:r>
-      <w:proofErr w:type="spellEnd"/>
-    </w:p>
-    <w:p>
-      <w:pPr>
-        <w:spacing w:line="180" w:lineRule="auto"/>
-        <w:rPr>
-          <w:rFonts w:asciiTheme="minorHAnsi" w:eastAsiaTheme="minorHAnsi"/>
-          <w:b/>
-          <w:bCs/>
-        </w:rPr>
-      </w:pPr>
-      <w:r>
-        <w:rPr>
-          <w:rFonts w:asciiTheme="minorHAnsi" w:eastAsiaTheme="minorHAnsi"/>
-          <w:b/>
-          <w:bCs/>
-        </w:rPr>
-        <w:t xml:space="preserve">    </w:t>
-      </w:r>
-      <w:r>
-        <w:rPr>
-          <w:rFonts w:asciiTheme="minorHAnsi" w:eastAsiaTheme="minorHAnsi" w:hint="eastAsia"/>
-          <w:b/>
-          <w:bCs/>
-        </w:rPr>
-        <w:t>└──</w:t>
-      </w:r>
-      <w:r>
-        <w:rPr>
-          <w:rFonts w:asciiTheme="minorHAnsi" w:eastAsiaTheme="minorHAnsi"/>
-          <w:b/>
-          <w:bCs/>
-        </w:rPr>
-        <w:t xml:space="preserve"> </w:t>
-      </w:r>
-      <w:proofErr w:type="spellStart"/>
-      <w:proofErr w:type="gramStart"/>
-      <w:r>
-        <w:rPr>
-          <w:rFonts w:asciiTheme="minorHAnsi" w:eastAsiaTheme="minorHAnsi"/>
-          <w:b/>
-          <w:bCs/>
-        </w:rPr>
-        <w:t>ActionManager.h</w:t>
-      </w:r>
-      <w:proofErr w:type="spellEnd"/>
-      <w:r>
-        <w:rPr>
-          <w:rFonts w:asciiTheme="minorHAnsi" w:eastAsiaTheme="minorHAnsi"/>
-          <w:b/>
-          <w:bCs/>
-        </w:rPr>
-        <w:t xml:space="preserve"> /</w:t>
-      </w:r>
-      <w:proofErr w:type="gramEnd"/>
-      <w:r>
-        <w:rPr>
-          <w:rFonts w:asciiTheme="minorHAnsi" w:eastAsiaTheme="minorHAnsi"/>
-          <w:b/>
-          <w:bCs/>
-        </w:rPr>
-        <w:t xml:space="preserve"> </w:t>
-      </w:r>
-      <w:proofErr w:type="spellStart"/>
-      <w:r>
-        <w:rPr>
-          <w:rFonts w:asciiTheme="minorHAnsi" w:eastAsiaTheme="minorHAnsi"/>
-          <w:b/>
-          <w:bCs/>
-        </w:rPr>
-        <w:t>UIRenderer.h</w:t>
-      </w:r>
-      <w:proofErr w:type="spellEnd"/>
+        <w:t xml:space="preserve"> ActionManager.h / UIRenderer.h</w:t>
+      </w:r>
     </w:p>
     <w:p>
       <w:pPr>
@@ -2956,37 +2360,13 @@
           <w:b/>
           <w:bCs/>
         </w:rPr>
-        <w:t xml:space="preserve">상태 </w:t>
-      </w:r>
-      <w:proofErr w:type="spellStart"/>
-      <w:r>
-        <w:rPr>
-          <w:rFonts w:asciiTheme="minorHAnsi" w:eastAsiaTheme="minorHAnsi"/>
-          <w:b/>
-          <w:bCs/>
-        </w:rPr>
-        <w:t>표시바</w:t>
-      </w:r>
-      <w:proofErr w:type="spellEnd"/>
-      <w:r>
-        <w:rPr>
-          <w:rFonts w:asciiTheme="minorHAnsi" w:eastAsiaTheme="minorHAnsi"/>
-        </w:rPr>
-        <w:t xml:space="preserve">: </w:t>
-      </w:r>
-      <w:proofErr w:type="spellStart"/>
-      <w:r>
-        <w:rPr>
-          <w:rFonts w:asciiTheme="minorHAnsi" w:eastAsiaTheme="minorHAnsi"/>
-        </w:rPr>
-        <w:t>drawBar</w:t>
-      </w:r>
-      <w:proofErr w:type="spellEnd"/>
-      <w:r>
-        <w:rPr>
-          <w:rFonts w:asciiTheme="minorHAnsi" w:eastAsiaTheme="minorHAnsi"/>
-        </w:rPr>
-        <w:t>() 메서드가 ■ 문자를 이용한 게이지 바를 출력. 만족도·스트레스·청결도·포만감·훈련도를 항상 화면 상단에 노출</w:t>
+        <w:t>상태 표시바</w:t>
+      </w:r>
+      <w:r>
+        <w:rPr>
+          <w:rFonts w:asciiTheme="minorHAnsi" w:eastAsiaTheme="minorHAnsi"/>
+        </w:rPr>
+        <w:t>: drawBar() 메서드가 ■ 문자를 이용한 게이지 바를 출력. 만족도·스트레스·청결도·포만감·훈련도를 항상 화면 상단에 노출</w:t>
       </w:r>
     </w:p>
     <w:p>
@@ -2999,57 +2379,19 @@
           <w:rFonts w:asciiTheme="minorHAnsi" w:eastAsiaTheme="minorHAnsi"/>
         </w:rPr>
       </w:pPr>
-      <w:proofErr w:type="spellStart"/>
-      <w:r>
-        <w:rPr>
-          <w:rFonts w:asciiTheme="minorHAnsi" w:eastAsiaTheme="minorHAnsi"/>
-          <w:b/>
-          <w:bCs/>
-        </w:rPr>
-        <w:t>SlowPrint</w:t>
-      </w:r>
-      <w:proofErr w:type="spellEnd"/>
-      <w:r>
-        <w:rPr>
-          <w:rFonts w:asciiTheme="minorHAnsi" w:eastAsiaTheme="minorHAnsi"/>
-          <w:b/>
-          <w:bCs/>
-        </w:rPr>
-        <w:t xml:space="preserve"> 연출</w:t>
-      </w:r>
-      <w:r>
-        <w:rPr>
-          <w:rFonts w:asciiTheme="minorHAnsi" w:eastAsiaTheme="minorHAnsi"/>
-        </w:rPr>
-        <w:t xml:space="preserve">: 스토리 장면은 글자를 한 자씩 딜레이를 주며 출력하는 </w:t>
-      </w:r>
-      <w:proofErr w:type="spellStart"/>
-      <w:r>
-        <w:rPr>
-          <w:rFonts w:asciiTheme="minorHAnsi" w:eastAsiaTheme="minorHAnsi"/>
-        </w:rPr>
-        <w:t>SlowPrint</w:t>
-      </w:r>
-      <w:proofErr w:type="spellEnd"/>
-      <w:r>
-        <w:rPr>
-          <w:rFonts w:asciiTheme="minorHAnsi" w:eastAsiaTheme="minorHAnsi"/>
-        </w:rPr>
-        <w:t xml:space="preserve">() 메서드로 </w:t>
-      </w:r>
-      <w:proofErr w:type="spellStart"/>
-      <w:r>
-        <w:rPr>
-          <w:rFonts w:asciiTheme="minorHAnsi" w:eastAsiaTheme="minorHAnsi"/>
-        </w:rPr>
-        <w:t>몰입감</w:t>
-      </w:r>
-      <w:proofErr w:type="spellEnd"/>
-      <w:r>
-        <w:rPr>
-          <w:rFonts w:asciiTheme="minorHAnsi" w:eastAsiaTheme="minorHAnsi"/>
-        </w:rPr>
-        <w:t xml:space="preserve"> 강화</w:t>
+      <w:r>
+        <w:rPr>
+          <w:rFonts w:asciiTheme="minorHAnsi" w:eastAsiaTheme="minorHAnsi"/>
+          <w:b/>
+          <w:bCs/>
+        </w:rPr>
+        <w:t>SlowPrint 연출</w:t>
+      </w:r>
+      <w:r>
+        <w:rPr>
+          <w:rFonts w:asciiTheme="minorHAnsi" w:eastAsiaTheme="minorHAnsi"/>
+        </w:rPr>
+        <w:t>: 스토리 장면은 글자를 한 자씩 딜레이를 주며 출력하는 SlowPrint() 메서드로 몰입감 강화</w:t>
       </w:r>
     </w:p>
     <w:p>
@@ -3074,21 +2416,7 @@
         <w:rPr>
           <w:rFonts w:asciiTheme="minorHAnsi" w:eastAsiaTheme="minorHAnsi"/>
         </w:rPr>
-        <w:t>: 행동을 선택하면 해당 행동에 대응하는 아스키 아트(</w:t>
-      </w:r>
-      <w:proofErr w:type="spellStart"/>
-      <w:r>
-        <w:rPr>
-          <w:rFonts w:asciiTheme="minorHAnsi" w:eastAsiaTheme="minorHAnsi"/>
-        </w:rPr>
-        <w:t>ActionArtRender</w:t>
-      </w:r>
-      <w:proofErr w:type="spellEnd"/>
-      <w:r>
-        <w:rPr>
-          <w:rFonts w:asciiTheme="minorHAnsi" w:eastAsiaTheme="minorHAnsi"/>
-        </w:rPr>
-        <w:t>())가 전환되어 시각적 피드백 제공</w:t>
+        <w:t>: 행동을 선택하면 해당 행동에 대응하는 아스키 아트(ActionArtRender())가 전환되어 시각적 피드백 제공</w:t>
       </w:r>
     </w:p>
     <w:p>
@@ -3113,21 +2441,7 @@
         <w:rPr>
           <w:rFonts w:asciiTheme="minorHAnsi" w:eastAsiaTheme="minorHAnsi"/>
         </w:rPr>
-        <w:t xml:space="preserve">: 각 엔딩마다 전용 아스키 아트를 출력하는 </w:t>
-      </w:r>
-      <w:proofErr w:type="spellStart"/>
-      <w:r>
-        <w:rPr>
-          <w:rFonts w:asciiTheme="minorHAnsi" w:eastAsiaTheme="minorHAnsi"/>
-        </w:rPr>
-        <w:t>EndingArtRender</w:t>
-      </w:r>
-      <w:proofErr w:type="spellEnd"/>
-      <w:r>
-        <w:rPr>
-          <w:rFonts w:asciiTheme="minorHAnsi" w:eastAsiaTheme="minorHAnsi"/>
-        </w:rPr>
-        <w:t>() 메서드 구현</w:t>
+        <w:t>: 각 엔딩마다 전용 아스키 아트를 출력하는 EndingArtRender() 메서드 구현</w:t>
       </w:r>
     </w:p>
     <w:p>
@@ -3398,21 +2712,7 @@
         <w:rPr>
           <w:rFonts w:asciiTheme="minorHAnsi" w:eastAsiaTheme="minorHAnsi"/>
         </w:rPr>
-        <w:t xml:space="preserve">프로젝트 속성 → C/C++ → </w:t>
-      </w:r>
-      <w:proofErr w:type="spellStart"/>
-      <w:r>
-        <w:rPr>
-          <w:rFonts w:asciiTheme="minorHAnsi" w:eastAsiaTheme="minorHAnsi"/>
-        </w:rPr>
-        <w:t>명령줄</w:t>
-      </w:r>
-      <w:proofErr w:type="spellEnd"/>
-      <w:r>
-        <w:rPr>
-          <w:rFonts w:asciiTheme="minorHAnsi" w:eastAsiaTheme="minorHAnsi"/>
-        </w:rPr>
-        <w:t>→/utf-8 입력 후 적용</w:t>
+        <w:t>프로젝트 속성 → C/C++ → 명령줄→/utf-8 입력 후 적용</w:t>
       </w:r>
     </w:p>
     <w:p>
@@ -3493,21 +2793,7 @@
         <w:rPr>
           <w:rFonts w:asciiTheme="minorHAnsi" w:eastAsiaTheme="minorHAnsi"/>
         </w:rPr>
-        <w:t>#include &lt;</w:t>
-      </w:r>
-      <w:proofErr w:type="spellStart"/>
-      <w:r>
-        <w:rPr>
-          <w:rFonts w:asciiTheme="minorHAnsi" w:eastAsiaTheme="minorHAnsi"/>
-        </w:rPr>
-        <w:t>windows.h</w:t>
-      </w:r>
-      <w:proofErr w:type="spellEnd"/>
-      <w:r>
-        <w:rPr>
-          <w:rFonts w:asciiTheme="minorHAnsi" w:eastAsiaTheme="minorHAnsi"/>
-        </w:rPr>
-        <w:t>&gt;</w:t>
+        <w:t>#include &lt;windows.h&gt;</w:t>
       </w:r>
     </w:p>
     <w:p>
@@ -3643,35 +2929,7 @@
         <w:rPr>
           <w:rFonts w:asciiTheme="minorHAnsi" w:eastAsiaTheme="minorHAnsi"/>
         </w:rPr>
-        <w:t>system("</w:t>
-      </w:r>
-      <w:proofErr w:type="spellStart"/>
-      <w:r>
-        <w:rPr>
-          <w:rFonts w:asciiTheme="minorHAnsi" w:eastAsiaTheme="minorHAnsi"/>
-        </w:rPr>
-        <w:t>chcp</w:t>
-      </w:r>
-      <w:proofErr w:type="spellEnd"/>
-      <w:r>
-        <w:rPr>
-          <w:rFonts w:asciiTheme="minorHAnsi" w:eastAsiaTheme="minorHAnsi"/>
-        </w:rPr>
-        <w:t xml:space="preserve"> 65001")</w:t>
-      </w:r>
-      <w:proofErr w:type="gramStart"/>
-      <w:r>
-        <w:rPr>
-          <w:rFonts w:asciiTheme="minorHAnsi" w:eastAsiaTheme="minorHAnsi"/>
-        </w:rPr>
-        <w:t>; /</w:t>
-      </w:r>
-      <w:proofErr w:type="gramEnd"/>
-      <w:r>
-        <w:rPr>
-          <w:rFonts w:asciiTheme="minorHAnsi" w:eastAsiaTheme="minorHAnsi"/>
-        </w:rPr>
-        <w:t>/ 터미널 코드페이지를 UTF-8(65001)로 변경</w:t>
+        <w:t>system("chcp 65001"); // 터미널 코드페이지를 UTF-8(65001)로 변경</w:t>
       </w:r>
     </w:p>
     <w:p>
@@ -3687,35 +2945,7 @@
         <w:rPr>
           <w:rFonts w:asciiTheme="minorHAnsi" w:eastAsiaTheme="minorHAnsi"/>
         </w:rPr>
-        <w:t>system("</w:t>
-      </w:r>
-      <w:proofErr w:type="spellStart"/>
-      <w:r>
-        <w:rPr>
-          <w:rFonts w:asciiTheme="minorHAnsi" w:eastAsiaTheme="minorHAnsi"/>
-        </w:rPr>
-        <w:t>cls</w:t>
-      </w:r>
-      <w:proofErr w:type="spellEnd"/>
-      <w:r>
-        <w:rPr>
-          <w:rFonts w:asciiTheme="minorHAnsi" w:eastAsiaTheme="minorHAnsi"/>
-        </w:rPr>
-        <w:t>")</w:t>
-      </w:r>
-      <w:proofErr w:type="gramStart"/>
-      <w:r>
-        <w:rPr>
-          <w:rFonts w:asciiTheme="minorHAnsi" w:eastAsiaTheme="minorHAnsi"/>
-        </w:rPr>
-        <w:t>; /</w:t>
-      </w:r>
-      <w:proofErr w:type="gramEnd"/>
-      <w:r>
-        <w:rPr>
-          <w:rFonts w:asciiTheme="minorHAnsi" w:eastAsiaTheme="minorHAnsi"/>
-        </w:rPr>
-        <w:t>/ 인코딩 변경 시 나타나는 시스템 메시지 삭제</w:t>
+        <w:t>system("cls"); // 인코딩 변경 시 나타나는 시스템 메시지 삭제</w:t>
       </w:r>
     </w:p>
     <w:p>
@@ -3800,89 +3030,11 @@
         </w:rPr>
         <w:t xml:space="preserve">문제 해결 과정: </w:t>
       </w:r>
-      <w:proofErr w:type="spellStart"/>
-      <w:r>
-        <w:rPr>
-          <w:rFonts w:asciiTheme="minorHAnsi" w:eastAsiaTheme="minorHAnsi" w:hint="eastAsia"/>
-        </w:rPr>
-        <w:t>Time.h</w:t>
-      </w:r>
-      <w:proofErr w:type="spellEnd"/>
-      <w:r>
-        <w:rPr>
-          <w:rFonts w:asciiTheme="minorHAnsi" w:eastAsiaTheme="minorHAnsi" w:hint="eastAsia"/>
-        </w:rPr>
-        <w:t xml:space="preserve">에 </w:t>
-      </w:r>
-      <w:proofErr w:type="spellStart"/>
-      <w:r>
-        <w:rPr>
-          <w:rFonts w:asciiTheme="minorHAnsi" w:eastAsiaTheme="minorHAnsi" w:hint="eastAsia"/>
-        </w:rPr>
-        <w:t>daily_count</w:t>
-      </w:r>
-      <w:proofErr w:type="spellEnd"/>
-      <w:r>
-        <w:rPr>
-          <w:rFonts w:asciiTheme="minorHAnsi" w:eastAsiaTheme="minorHAnsi" w:hint="eastAsia"/>
-        </w:rPr>
-        <w:t xml:space="preserve">와 </w:t>
-      </w:r>
-      <w:proofErr w:type="spellStart"/>
-      <w:r>
-        <w:rPr>
-          <w:rFonts w:asciiTheme="minorHAnsi" w:eastAsiaTheme="minorHAnsi" w:hint="eastAsia"/>
-        </w:rPr>
-        <w:t>week_count</w:t>
-      </w:r>
-      <w:proofErr w:type="spellEnd"/>
-      <w:r>
-        <w:rPr>
-          <w:rFonts w:asciiTheme="minorHAnsi" w:eastAsiaTheme="minorHAnsi" w:hint="eastAsia"/>
-        </w:rPr>
-        <w:t xml:space="preserve"> 두개가 존재 </w:t>
-      </w:r>
-      <w:proofErr w:type="spellStart"/>
-      <w:r>
-        <w:rPr>
-          <w:rFonts w:asciiTheme="minorHAnsi" w:eastAsiaTheme="minorHAnsi" w:hint="eastAsia"/>
-        </w:rPr>
-        <w:t>했었지만</w:t>
-      </w:r>
-      <w:proofErr w:type="spellEnd"/>
-      <w:r>
-        <w:rPr>
-          <w:rFonts w:asciiTheme="minorHAnsi" w:eastAsiaTheme="minorHAnsi" w:hint="eastAsia"/>
-        </w:rPr>
-        <w:t xml:space="preserve"> </w:t>
-      </w:r>
-      <w:proofErr w:type="spellStart"/>
-      <w:r>
-        <w:rPr>
-          <w:rFonts w:asciiTheme="minorHAnsi" w:eastAsiaTheme="minorHAnsi" w:hint="eastAsia"/>
-        </w:rPr>
-        <w:t>daily_count</w:t>
-      </w:r>
-      <w:proofErr w:type="spellEnd"/>
-      <w:r>
-        <w:rPr>
-          <w:rFonts w:asciiTheme="minorHAnsi" w:eastAsiaTheme="minorHAnsi" w:hint="eastAsia"/>
-        </w:rPr>
-        <w:t xml:space="preserve">를 없애고 </w:t>
-      </w:r>
-      <w:proofErr w:type="spellStart"/>
-      <w:r>
-        <w:rPr>
-          <w:rFonts w:asciiTheme="minorHAnsi" w:eastAsiaTheme="minorHAnsi" w:hint="eastAsia"/>
-        </w:rPr>
-        <w:t>week_count</w:t>
-      </w:r>
-      <w:proofErr w:type="spellEnd"/>
-      <w:r>
-        <w:rPr>
-          <w:rFonts w:asciiTheme="minorHAnsi" w:eastAsiaTheme="minorHAnsi" w:hint="eastAsia"/>
-        </w:rPr>
-        <w:t>로만 다뤄지게 수정</w:t>
+      <w:r>
+        <w:rPr>
+          <w:rFonts w:asciiTheme="minorHAnsi" w:eastAsiaTheme="minorHAnsi" w:hint="eastAsia"/>
+        </w:rPr>
+        <w:t>Time.h에 daily_count와 week_count 두개가 존재 했었지만 daily_count를 없애고 week_count로만 다뤄지게 수정</w:t>
       </w:r>
     </w:p>
     <w:p>
@@ -3919,7 +3071,6 @@
           <w:rFonts w:asciiTheme="minorHAnsi" w:eastAsiaTheme="minorHAnsi"/>
         </w:rPr>
       </w:pPr>
-      <w:proofErr w:type="spellStart"/>
       <w:r>
         <w:rPr>
           <w:rFonts w:asciiTheme="minorHAnsi" w:eastAsiaTheme="minorHAnsi" w:hint="eastAsia"/>
@@ -3928,25 +3079,14 @@
         </w:rPr>
         <w:t>히든</w:t>
       </w:r>
-      <w:proofErr w:type="spellEnd"/>
-      <w:r>
-        <w:rPr>
-          <w:rFonts w:asciiTheme="minorHAnsi" w:eastAsiaTheme="minorHAnsi" w:hint="eastAsia"/>
-          <w:b/>
-          <w:bCs/>
-        </w:rPr>
-        <w:t>/</w:t>
-      </w:r>
-      <w:proofErr w:type="spellStart"/>
-      <w:r>
-        <w:rPr>
-          <w:rFonts w:asciiTheme="minorHAnsi" w:eastAsiaTheme="minorHAnsi" w:hint="eastAsia"/>
-          <w:b/>
-          <w:bCs/>
-        </w:rPr>
-        <w:t>배드</w:t>
-      </w:r>
-      <w:proofErr w:type="spellEnd"/>
+      <w:r>
+        <w:rPr>
+          <w:rFonts w:asciiTheme="minorHAnsi" w:eastAsiaTheme="minorHAnsi" w:hint="eastAsia"/>
+          <w:b/>
+          <w:bCs/>
+        </w:rPr>
+        <w:t>/배드</w:t>
+      </w:r>
       <w:r>
         <w:rPr>
           <w:rFonts w:asciiTheme="minorHAnsi" w:eastAsiaTheme="minorHAnsi" w:hint="eastAsia"/>
@@ -3967,21 +3107,7 @@
         <w:rPr>
           <w:rFonts w:asciiTheme="minorHAnsi" w:eastAsiaTheme="minorHAnsi"/>
         </w:rPr>
-        <w:t xml:space="preserve">초기 기획 시 </w:t>
-      </w:r>
-      <w:proofErr w:type="spellStart"/>
-      <w:r>
-        <w:rPr>
-          <w:rFonts w:asciiTheme="minorHAnsi" w:eastAsiaTheme="minorHAnsi"/>
-        </w:rPr>
-        <w:t>히든</w:t>
-      </w:r>
-      <w:proofErr w:type="spellEnd"/>
-      <w:r>
-        <w:rPr>
-          <w:rFonts w:asciiTheme="minorHAnsi" w:eastAsiaTheme="minorHAnsi"/>
-        </w:rPr>
-        <w:t xml:space="preserve"> 엔딩 조건을 "만족도 100 + 특정 수치 100"으로 설정하였으나, 실제 플레이 테스트 결과 8주 안에 해당 조건을 동시에 달성하는 것이 현실적으로 불가능함을 확인</w:t>
+        <w:t>초기 기획 시 히든 엔딩 조건을 "만족도 100 + 특정 수치 100"으로 설정하였으나, 실제 플레이 테스트 결과 8주 안에 해당 조건을 동시에 달성하는 것이 현실적으로 불가능함을 확인</w:t>
       </w:r>
       <w:r>
         <w:rPr>
@@ -3993,21 +3119,7 @@
         <w:rPr>
           <w:rFonts w:asciiTheme="minorHAnsi" w:eastAsiaTheme="minorHAnsi" w:hint="eastAsia"/>
         </w:rPr>
-        <w:t xml:space="preserve">또한 </w:t>
-      </w:r>
-      <w:proofErr w:type="spellStart"/>
-      <w:r>
-        <w:rPr>
-          <w:rFonts w:asciiTheme="minorHAnsi" w:eastAsiaTheme="minorHAnsi" w:hint="eastAsia"/>
-        </w:rPr>
-        <w:t>배드엔딩</w:t>
-      </w:r>
-      <w:proofErr w:type="spellEnd"/>
-      <w:r>
-        <w:rPr>
-          <w:rFonts w:asciiTheme="minorHAnsi" w:eastAsiaTheme="minorHAnsi" w:hint="eastAsia"/>
-        </w:rPr>
-        <w:t xml:space="preserve"> 조건을 </w:t>
+        <w:t xml:space="preserve">또한 배드엔딩 조건을 </w:t>
       </w:r>
       <w:r>
         <w:rPr>
@@ -4031,15 +3143,7 @@
         <w:rPr>
           <w:rFonts w:asciiTheme="minorHAnsi" w:eastAsiaTheme="minorHAnsi" w:hint="eastAsia"/>
         </w:rPr>
-        <w:t xml:space="preserve">로 설정하였으나, 실제 플레이 테스트 결과 만족도가 25이하로 </w:t>
-      </w:r>
-      <w:proofErr w:type="spellStart"/>
-      <w:proofErr w:type="gramStart"/>
-      <w:r>
-        <w:rPr>
-          <w:rFonts w:asciiTheme="minorHAnsi" w:eastAsiaTheme="minorHAnsi" w:hint="eastAsia"/>
-        </w:rPr>
-        <w:t>떨어지는</w:t>
+        <w:t>로 설정하였으나, 실제 플레이 테스트 결과 만족도가 25이하로 떨어지는</w:t>
       </w:r>
       <w:r>
         <w:rPr>
@@ -4047,8 +3151,6 @@
         </w:rPr>
         <w:t>게</w:t>
       </w:r>
-      <w:proofErr w:type="spellEnd"/>
-      <w:proofErr w:type="gramEnd"/>
       <w:r>
         <w:rPr>
           <w:rFonts w:asciiTheme="minorHAnsi" w:eastAsiaTheme="minorHAnsi" w:hint="eastAsia"/>
@@ -4083,19 +3185,11 @@
         </w:rPr>
         <w:t xml:space="preserve">문제 해결 과정: </w:t>
       </w:r>
-      <w:proofErr w:type="spellStart"/>
-      <w:r>
-        <w:rPr>
-          <w:rFonts w:asciiTheme="minorHAnsi" w:eastAsiaTheme="minorHAnsi"/>
-        </w:rPr>
-        <w:t>히든</w:t>
-      </w:r>
-      <w:proofErr w:type="spellEnd"/>
-      <w:r>
-        <w:rPr>
-          <w:rFonts w:asciiTheme="minorHAnsi" w:eastAsiaTheme="minorHAnsi"/>
-        </w:rPr>
-        <w:t xml:space="preserve"> 엔딩 3종의 발동 조건에서 만족도 기준을 완화하여 달성 가능한 수준으로 </w:t>
+      <w:r>
+        <w:rPr>
+          <w:rFonts w:asciiTheme="minorHAnsi" w:eastAsiaTheme="minorHAnsi"/>
+        </w:rPr>
+        <w:t xml:space="preserve">히든 엔딩 3종의 발동 조건에서 만족도 기준을 완화하여 달성 가능한 수준으로 </w:t>
       </w:r>
       <w:r>
         <w:rPr>
@@ -4130,19 +3224,11 @@
           <w:rFonts w:asciiTheme="minorHAnsi" w:eastAsiaTheme="minorHAnsi"/>
         </w:rPr>
       </w:pPr>
-      <w:proofErr w:type="spellStart"/>
-      <w:r>
-        <w:rPr>
-          <w:rFonts w:asciiTheme="minorHAnsi" w:eastAsiaTheme="minorHAnsi" w:hint="eastAsia"/>
-        </w:rPr>
-        <w:t>배드엔딩이</w:t>
-      </w:r>
-      <w:proofErr w:type="spellEnd"/>
-      <w:r>
-        <w:rPr>
-          <w:rFonts w:asciiTheme="minorHAnsi" w:eastAsiaTheme="minorHAnsi" w:hint="eastAsia"/>
-        </w:rPr>
-        <w:t xml:space="preserve"> 실제로 발생할 수 있도록 조건 수치를 상향 조정했습니다.</w:t>
+      <w:r>
+        <w:rPr>
+          <w:rFonts w:asciiTheme="minorHAnsi" w:eastAsiaTheme="minorHAnsi" w:hint="eastAsia"/>
+        </w:rPr>
+        <w:t>배드엔딩이 실제로 발생할 수 있도록 조건 수치를 상향 조정했습니다.</w:t>
       </w:r>
       <w:r>
         <w:rPr>
@@ -4168,36 +3254,14 @@
         <w:rPr>
           <w:rFonts w:asciiTheme="minorHAnsi" w:eastAsiaTheme="minorHAnsi"/>
         </w:rPr>
-        <w:t xml:space="preserve">플레이어가 8주 내에 </w:t>
-      </w:r>
-      <w:proofErr w:type="spellStart"/>
-      <w:r>
-        <w:rPr>
-          <w:rFonts w:asciiTheme="minorHAnsi" w:eastAsiaTheme="minorHAnsi"/>
-        </w:rPr>
-        <w:t>히든</w:t>
-      </w:r>
-      <w:proofErr w:type="spellEnd"/>
-      <w:r>
-        <w:rPr>
-          <w:rFonts w:asciiTheme="minorHAnsi" w:eastAsiaTheme="minorHAnsi"/>
-        </w:rPr>
-        <w:t xml:space="preserve"> 엔</w:t>
-      </w:r>
-      <w:r>
-        <w:rPr>
-          <w:rFonts w:asciiTheme="minorHAnsi" w:eastAsiaTheme="minorHAnsi" w:hint="eastAsia"/>
-        </w:rPr>
-        <w:t xml:space="preserve">딩과 </w:t>
-      </w:r>
-      <w:proofErr w:type="spellStart"/>
-      <w:r>
-        <w:rPr>
-          <w:rFonts w:asciiTheme="minorHAnsi" w:eastAsiaTheme="minorHAnsi" w:hint="eastAsia"/>
-        </w:rPr>
-        <w:t>배드엔딩을</w:t>
-      </w:r>
-      <w:proofErr w:type="spellEnd"/>
+        <w:t>플레이어가 8주 내에 히든 엔</w:t>
+      </w:r>
+      <w:r>
+        <w:rPr>
+          <w:rFonts w:asciiTheme="minorHAnsi" w:eastAsiaTheme="minorHAnsi" w:hint="eastAsia"/>
+        </w:rPr>
+        <w:t>딩과 배드엔딩을</w:t>
+      </w:r>
       <w:r>
         <w:rPr>
           <w:rFonts w:asciiTheme="minorHAnsi" w:eastAsiaTheme="minorHAnsi"/>
@@ -4389,7 +3453,6 @@
           <w14:ligatures w14:val="none"/>
         </w:rPr>
       </w:pPr>
-      <w:proofErr w:type="spellStart"/>
       <w:r>
         <w:rPr>
           <w:rFonts w:asciiTheme="minorHAnsi" w:eastAsiaTheme="minorHAnsi" w:cs="굴림"/>
@@ -4398,40 +3461,7 @@
           <w:bdr w:val="none" w:sz="0" w:space="0" w:color="auto" w:frame="1"/>
           <w14:ligatures w14:val="none"/>
         </w:rPr>
-        <w:t>다마고치와</w:t>
-      </w:r>
-      <w:proofErr w:type="spellEnd"/>
-      <w:r>
-        <w:rPr>
-          <w:rFonts w:asciiTheme="minorHAnsi" w:eastAsiaTheme="minorHAnsi" w:cs="굴림"/>
-          <w:kern w:val="0"/>
-          <w:szCs w:val="22"/>
-          <w:bdr w:val="none" w:sz="0" w:space="0" w:color="auto" w:frame="1"/>
-          <w14:ligatures w14:val="none"/>
-        </w:rPr>
-        <w:t xml:space="preserve"> 같은 고전 육성 게임의 핵심 메커니즘(수치 관리, 성장 단계, 엔딩 분기)을 콘솔 환경에서 직접 </w:t>
-      </w:r>
-      <w:proofErr w:type="spellStart"/>
-      <w:r>
-        <w:rPr>
-          <w:rFonts w:asciiTheme="minorHAnsi" w:eastAsiaTheme="minorHAnsi" w:cs="굴림"/>
-          <w:kern w:val="0"/>
-          <w:szCs w:val="22"/>
-          <w:bdr w:val="none" w:sz="0" w:space="0" w:color="auto" w:frame="1"/>
-          <w14:ligatures w14:val="none"/>
-        </w:rPr>
-        <w:t>구현해봄으로써</w:t>
-      </w:r>
-      <w:proofErr w:type="spellEnd"/>
-      <w:r>
-        <w:rPr>
-          <w:rFonts w:asciiTheme="minorHAnsi" w:eastAsiaTheme="minorHAnsi" w:cs="굴림"/>
-          <w:kern w:val="0"/>
-          <w:szCs w:val="22"/>
-          <w:bdr w:val="none" w:sz="0" w:space="0" w:color="auto" w:frame="1"/>
-          <w14:ligatures w14:val="none"/>
-        </w:rPr>
-        <w:t xml:space="preserve"> 게임 로직 설계 경험을 </w:t>
+        <w:t xml:space="preserve">다마고치와 같은 고전 육성 게임의 핵심 메커니즘(수치 관리, 성장 단계, 엔딩 분기)을 콘솔 환경에서 직접 구현해봄으로써 게임 로직 설계 경험을 </w:t>
       </w:r>
       <w:r>
         <w:rPr>
@@ -4520,7 +3550,6 @@
           <w14:ligatures w14:val="none"/>
         </w:rPr>
       </w:pPr>
-      <w:proofErr w:type="spellStart"/>
       <w:r>
         <w:rPr>
           <w:rFonts w:asciiTheme="minorHAnsi" w:eastAsiaTheme="minorHAnsi" w:cs="굴림"/>
@@ -4529,106 +3558,7 @@
           <w:bdr w:val="none" w:sz="0" w:space="0" w:color="auto" w:frame="1"/>
           <w14:ligatures w14:val="none"/>
         </w:rPr>
-        <w:t>GameEntity</w:t>
-      </w:r>
-      <w:proofErr w:type="spellEnd"/>
-      <w:r>
-        <w:rPr>
-          <w:rFonts w:asciiTheme="minorHAnsi" w:eastAsiaTheme="minorHAnsi" w:cs="굴림"/>
-          <w:kern w:val="0"/>
-          <w:szCs w:val="22"/>
-          <w:bdr w:val="none" w:sz="0" w:space="0" w:color="auto" w:frame="1"/>
-          <w14:ligatures w14:val="none"/>
-        </w:rPr>
-        <w:t xml:space="preserve">, </w:t>
-      </w:r>
-      <w:proofErr w:type="spellStart"/>
-      <w:r>
-        <w:rPr>
-          <w:rFonts w:asciiTheme="minorHAnsi" w:eastAsiaTheme="minorHAnsi" w:cs="굴림"/>
-          <w:kern w:val="0"/>
-          <w:szCs w:val="22"/>
-          <w:bdr w:val="none" w:sz="0" w:space="0" w:color="auto" w:frame="1"/>
-          <w14:ligatures w14:val="none"/>
-        </w:rPr>
-        <w:t>GameEngine</w:t>
-      </w:r>
-      <w:proofErr w:type="spellEnd"/>
-      <w:r>
-        <w:rPr>
-          <w:rFonts w:asciiTheme="minorHAnsi" w:eastAsiaTheme="minorHAnsi" w:cs="굴림"/>
-          <w:kern w:val="0"/>
-          <w:szCs w:val="22"/>
-          <w:bdr w:val="none" w:sz="0" w:space="0" w:color="auto" w:frame="1"/>
-          <w14:ligatures w14:val="none"/>
-        </w:rPr>
-        <w:t xml:space="preserve">, </w:t>
-      </w:r>
-      <w:proofErr w:type="spellStart"/>
-      <w:r>
-        <w:rPr>
-          <w:rFonts w:asciiTheme="minorHAnsi" w:eastAsiaTheme="minorHAnsi" w:cs="굴림"/>
-          <w:kern w:val="0"/>
-          <w:szCs w:val="22"/>
-          <w:bdr w:val="none" w:sz="0" w:space="0" w:color="auto" w:frame="1"/>
-          <w14:ligatures w14:val="none"/>
-        </w:rPr>
-        <w:t>ActionManager</w:t>
-      </w:r>
-      <w:proofErr w:type="spellEnd"/>
-      <w:r>
-        <w:rPr>
-          <w:rFonts w:asciiTheme="minorHAnsi" w:eastAsiaTheme="minorHAnsi" w:cs="굴림"/>
-          <w:kern w:val="0"/>
-          <w:szCs w:val="22"/>
-          <w:bdr w:val="none" w:sz="0" w:space="0" w:color="auto" w:frame="1"/>
-          <w14:ligatures w14:val="none"/>
-        </w:rPr>
-        <w:t xml:space="preserve">, </w:t>
-      </w:r>
-      <w:proofErr w:type="spellStart"/>
-      <w:r>
-        <w:rPr>
-          <w:rFonts w:asciiTheme="minorHAnsi" w:eastAsiaTheme="minorHAnsi" w:cs="굴림"/>
-          <w:kern w:val="0"/>
-          <w:szCs w:val="22"/>
-          <w:bdr w:val="none" w:sz="0" w:space="0" w:color="auto" w:frame="1"/>
-          <w14:ligatures w14:val="none"/>
-        </w:rPr>
-        <w:t>UIRenderer</w:t>
-      </w:r>
-      <w:proofErr w:type="spellEnd"/>
-      <w:r>
-        <w:rPr>
-          <w:rFonts w:asciiTheme="minorHAnsi" w:eastAsiaTheme="minorHAnsi" w:cs="굴림"/>
-          <w:kern w:val="0"/>
-          <w:szCs w:val="22"/>
-          <w:bdr w:val="none" w:sz="0" w:space="0" w:color="auto" w:frame="1"/>
-          <w14:ligatures w14:val="none"/>
-        </w:rPr>
-        <w:t xml:space="preserve">, </w:t>
-      </w:r>
-      <w:proofErr w:type="spellStart"/>
-      <w:r>
-        <w:rPr>
-          <w:rFonts w:asciiTheme="minorHAnsi" w:eastAsiaTheme="minorHAnsi" w:cs="굴림"/>
-          <w:kern w:val="0"/>
-          <w:szCs w:val="22"/>
-          <w:bdr w:val="none" w:sz="0" w:space="0" w:color="auto" w:frame="1"/>
-          <w14:ligatures w14:val="none"/>
-        </w:rPr>
-        <w:t>GameManager</w:t>
-      </w:r>
-      <w:proofErr w:type="spellEnd"/>
-      <w:r>
-        <w:rPr>
-          <w:rFonts w:asciiTheme="minorHAnsi" w:eastAsiaTheme="minorHAnsi" w:cs="굴림"/>
-          <w:kern w:val="0"/>
-          <w:szCs w:val="22"/>
-          <w:bdr w:val="none" w:sz="0" w:space="0" w:color="auto" w:frame="1"/>
-          <w14:ligatures w14:val="none"/>
-        </w:rPr>
-        <w:t xml:space="preserve"> 5개 클래스의 역할을 명확히 분리하여 객체지향 설계 원칙을 적용한 구조를 완성</w:t>
+        <w:t>GameEntity, GameEngine, ActionManager, UIRenderer, GameManager 5개 클래스의 역할을 명확히 분리하여 객체지향 설계 원칙을 적용한 구조를 완성</w:t>
       </w:r>
     </w:p>
     <w:p>
@@ -4742,21 +3672,7 @@
         <w:rPr>
           <w:rFonts w:asciiTheme="minorHAnsi" w:eastAsiaTheme="minorHAnsi"/>
         </w:rPr>
-        <w:t xml:space="preserve">아이템 인벤토리 시스템(훈련 → 아이템 획득 → 먹이 선택지 해금), 반항 이벤트 시스템(스트레스 50 이상 시 20% 확률 페널티), </w:t>
-      </w:r>
-      <w:proofErr w:type="spellStart"/>
-      <w:r>
-        <w:rPr>
-          <w:rFonts w:asciiTheme="minorHAnsi" w:eastAsiaTheme="minorHAnsi"/>
-        </w:rPr>
-        <w:t>SlowPrint</w:t>
-      </w:r>
-      <w:proofErr w:type="spellEnd"/>
-      <w:r>
-        <w:rPr>
-          <w:rFonts w:asciiTheme="minorHAnsi" w:eastAsiaTheme="minorHAnsi"/>
-        </w:rPr>
-        <w:t xml:space="preserve"> 텍스트 연출 및 행동별 아스키 아트 전환 UI를 완성</w:t>
+        <w:t>아이템 인벤토리 시스템(훈련 → 아이템 획득 → 먹이 선택지 해금), 반항 이벤트 시스템(스트레스 50 이상 시 20% 확률 페널티), SlowPrint 텍스트 연출 및 행동별 아스키 아트 전환 UI를 완성</w:t>
       </w:r>
     </w:p>
     <w:p>
@@ -4796,19 +3712,11 @@
           <w:rFonts w:asciiTheme="minorHAnsi" w:eastAsiaTheme="minorHAnsi"/>
         </w:rPr>
       </w:pPr>
-      <w:proofErr w:type="gramStart"/>
-      <w:r>
-        <w:rPr>
-          <w:rFonts w:asciiTheme="minorHAnsi" w:eastAsiaTheme="minorHAnsi"/>
-        </w:rPr>
-        <w:t>저장 /</w:t>
-      </w:r>
-      <w:proofErr w:type="gramEnd"/>
-      <w:r>
-        <w:rPr>
-          <w:rFonts w:asciiTheme="minorHAnsi" w:eastAsiaTheme="minorHAnsi"/>
-        </w:rPr>
-        <w:t xml:space="preserve"> 불러오기 기능 추가 (파일 입출력)</w:t>
+      <w:r>
+        <w:rPr>
+          <w:rFonts w:asciiTheme="minorHAnsi" w:eastAsiaTheme="minorHAnsi"/>
+        </w:rPr>
+        <w:t>저장 / 불러오기 기능 추가 (파일 입출력)</w:t>
       </w:r>
     </w:p>
     <w:p>
@@ -4961,7 +3869,6 @@
             <w:pPr>
               <w:jc w:val="center"/>
             </w:pPr>
-            <w:proofErr w:type="spellStart"/>
             <w:r>
               <w:rPr>
                 <w:rFonts w:asciiTheme="minorHAnsi" w:eastAsiaTheme="minorHAnsi"/>
@@ -4971,7 +3878,6 @@
               </w:rPr>
               <w:t>배드</w:t>
             </w:r>
-            <w:proofErr w:type="spellEnd"/>
           </w:p>
         </w:tc>
         <w:tc>
@@ -5173,7 +4079,6 @@
             <w:pPr>
               <w:jc w:val="center"/>
             </w:pPr>
-            <w:proofErr w:type="spellStart"/>
             <w:r>
               <w:rPr>
                 <w:rFonts w:asciiTheme="minorHAnsi" w:eastAsiaTheme="minorHAnsi"/>
@@ -5182,7 +4087,6 @@
               </w:rPr>
               <w:t>노말</w:t>
             </w:r>
-            <w:proofErr w:type="spellEnd"/>
           </w:p>
         </w:tc>
         <w:tc>
@@ -5256,21 +4160,7 @@
               <w:rPr>
                 <w:rFonts w:asciiTheme="minorHAnsi" w:eastAsiaTheme="minorHAnsi"/>
               </w:rPr>
-              <w:t xml:space="preserve">예상치 못한 </w:t>
-            </w:r>
-            <w:proofErr w:type="gramStart"/>
-            <w:r>
-              <w:rPr>
-                <w:rFonts w:asciiTheme="minorHAnsi" w:eastAsiaTheme="minorHAnsi"/>
-              </w:rPr>
-              <w:t>동거 /</w:t>
-            </w:r>
-            <w:proofErr w:type="gramEnd"/>
-            <w:r>
-              <w:rPr>
-                <w:rFonts w:asciiTheme="minorHAnsi" w:eastAsiaTheme="minorHAnsi"/>
-              </w:rPr>
-              <w:t xml:space="preserve"> 방생 성공</w:t>
+              <w:t>예상치 못한 동거 / 방생 성공</w:t>
             </w:r>
           </w:p>
         </w:tc>
@@ -5356,7 +4246,6 @@
             <w:pPr>
               <w:jc w:val="center"/>
             </w:pPr>
-            <w:proofErr w:type="spellStart"/>
             <w:r>
               <w:rPr>
                 <w:rFonts w:asciiTheme="minorHAnsi" w:eastAsiaTheme="minorHAnsi"/>
@@ -5366,7 +4255,6 @@
               </w:rPr>
               <w:t>히든</w:t>
             </w:r>
-            <w:proofErr w:type="spellEnd"/>
           </w:p>
         </w:tc>
         <w:tc>
@@ -5426,21 +4314,7 @@
               <w:rPr>
                 <w:rFonts w:asciiTheme="minorHAnsi" w:eastAsiaTheme="minorHAnsi"/>
               </w:rPr>
-              <w:t xml:space="preserve">새이기를 </w:t>
-            </w:r>
-            <w:proofErr w:type="spellStart"/>
-            <w:r>
-              <w:rPr>
-                <w:rFonts w:asciiTheme="minorHAnsi" w:eastAsiaTheme="minorHAnsi"/>
-              </w:rPr>
-              <w:t>포기한거야</w:t>
-            </w:r>
-            <w:proofErr w:type="spellEnd"/>
-            <w:r>
-              <w:rPr>
-                <w:rFonts w:asciiTheme="minorHAnsi" w:eastAsiaTheme="minorHAnsi"/>
-              </w:rPr>
-              <w:t>?</w:t>
+              <w:t>새이기를 포기한거야?</w:t>
             </w:r>
           </w:p>
         </w:tc>
@@ -5561,6 +4435,13 @@
       <w:pPr>
         <w:rPr>
           <w:rFonts w:asciiTheme="minorHAnsi" w:eastAsiaTheme="minorHAnsi"/>
+        </w:rPr>
+      </w:pPr>
+    </w:p>
+    <w:p>
+      <w:pPr>
+        <w:rPr>
+          <w:rFonts w:asciiTheme="minorHAnsi" w:eastAsiaTheme="minorHAnsi" w:hint="eastAsia"/>
           <w:b/>
           <w:bCs/>
         </w:rPr>
@@ -5696,6 +4577,14 @@
         </w:rPr>
         <w:t xml:space="preserve"> 제작</w:t>
       </w:r>
+      <w:r>
+        <w:rPr>
+          <w:rFonts w:asciiTheme="minorHAnsi" w:eastAsiaTheme="minorHAnsi" w:hint="eastAsia"/>
+          <w:b/>
+          <w:bCs/>
+        </w:rPr>
+        <w:t>, 발표</w:t>
+      </w:r>
     </w:p>
     <w:p>
       <w:pPr>
@@ -5708,49 +4597,25 @@
           <w:rFonts w:asciiTheme="minorHAnsi" w:eastAsiaTheme="minorHAnsi"/>
         </w:rPr>
       </w:pPr>
-      <w:proofErr w:type="spellStart"/>
-      <w:r>
-        <w:rPr>
-          <w:rFonts w:asciiTheme="minorHAnsi" w:eastAsiaTheme="minorHAnsi"/>
-          <w:b/>
-          <w:bCs/>
-        </w:rPr>
-        <w:t>GameEntity</w:t>
-      </w:r>
-      <w:proofErr w:type="spellEnd"/>
-      <w:r>
-        <w:rPr>
-          <w:rFonts w:asciiTheme="minorHAnsi" w:eastAsiaTheme="minorHAnsi"/>
-          <w:b/>
-          <w:bCs/>
-        </w:rPr>
-        <w:t xml:space="preserve"> (새 객체 클래스)</w:t>
-      </w:r>
-      <w:r>
-        <w:rPr>
-          <w:rFonts w:asciiTheme="minorHAnsi" w:eastAsiaTheme="minorHAnsi"/>
-        </w:rPr>
-        <w:t xml:space="preserve">: 새의 4가지 핵심 수치(포만감, 청결도, </w:t>
-      </w:r>
-      <w:proofErr w:type="gramStart"/>
-      <w:r>
-        <w:rPr>
-          <w:rFonts w:asciiTheme="minorHAnsi" w:eastAsiaTheme="minorHAnsi"/>
-        </w:rPr>
-        <w:t>훈련도,</w:t>
-      </w:r>
-      <w:r>
-        <w:rPr>
-          <w:rFonts w:asciiTheme="minorHAnsi" w:eastAsiaTheme="minorHAnsi" w:hint="eastAsia"/>
-        </w:rPr>
-        <w:t xml:space="preserve">   </w:t>
-      </w:r>
-      <w:proofErr w:type="gramEnd"/>
-      <w:r>
-        <w:rPr>
-          <w:rFonts w:asciiTheme="minorHAnsi" w:eastAsiaTheme="minorHAnsi" w:hint="eastAsia"/>
-        </w:rPr>
-        <w:t xml:space="preserve"> </w:t>
+      <w:r>
+        <w:rPr>
+          <w:rFonts w:asciiTheme="minorHAnsi" w:eastAsiaTheme="minorHAnsi"/>
+          <w:b/>
+          <w:bCs/>
+        </w:rPr>
+        <w:t>GameEntity (새 객체 클래스)</w:t>
+      </w:r>
+      <w:r>
+        <w:rPr>
+          <w:rFonts w:asciiTheme="minorHAnsi" w:eastAsiaTheme="minorHAnsi"/>
+        </w:rPr>
+        <w:t>: 새의 4가지 핵심 수치(포만감, 청결도, 훈련도,</w:t>
+      </w:r>
+      <w:r>
+        <w:rPr>
+          <w:rFonts w:asciiTheme="minorHAnsi" w:eastAsiaTheme="minorHAnsi" w:hint="eastAsia"/>
+        </w:rPr>
+        <w:t xml:space="preserve">    </w:t>
       </w:r>
       <w:r>
         <w:rPr>
@@ -5804,18 +4669,8 @@
           <w:b/>
           <w:bCs/>
         </w:rPr>
-        <w:t xml:space="preserve">: </w:t>
-      </w:r>
-      <w:proofErr w:type="spellStart"/>
-      <w:r>
-        <w:rPr>
-          <w:rFonts w:asciiTheme="minorHAnsi" w:eastAsiaTheme="minorHAnsi"/>
-          <w:b/>
-          <w:bCs/>
-        </w:rPr>
-        <w:t>최연채</w:t>
-      </w:r>
-      <w:proofErr w:type="spellEnd"/>
+        <w:t>: 최연채</w:t>
+      </w:r>
     </w:p>
     <w:p>
       <w:pPr>
@@ -5874,23 +4729,13 @@
           <w:rFonts w:asciiTheme="minorHAnsi" w:eastAsiaTheme="minorHAnsi"/>
         </w:rPr>
       </w:pPr>
-      <w:proofErr w:type="spellStart"/>
-      <w:r>
-        <w:rPr>
-          <w:rFonts w:asciiTheme="minorHAnsi" w:eastAsiaTheme="minorHAnsi" w:hint="eastAsia"/>
-          <w:b/>
-          <w:bCs/>
-        </w:rPr>
-        <w:t>GameManager</w:t>
-      </w:r>
-      <w:proofErr w:type="spellEnd"/>
-      <w:r>
-        <w:rPr>
-          <w:rFonts w:asciiTheme="minorHAnsi" w:eastAsiaTheme="minorHAnsi" w:hint="eastAsia"/>
-          <w:b/>
-          <w:bCs/>
-        </w:rPr>
-        <w:t xml:space="preserve"> (전체 프로세스 제어 클래스): </w:t>
+      <w:r>
+        <w:rPr>
+          <w:rFonts w:asciiTheme="minorHAnsi" w:eastAsiaTheme="minorHAnsi" w:hint="eastAsia"/>
+          <w:b/>
+          <w:bCs/>
+        </w:rPr>
+        <w:t xml:space="preserve">GameManager (전체 프로세스 제어 클래스): </w:t>
       </w:r>
       <w:r>
         <w:rPr>
@@ -5904,6 +4749,48 @@
         </w:rPr>
         <w:t xml:space="preserve"> 메인 로직 구현</w:t>
       </w:r>
+    </w:p>
+    <w:p>
+      <w:pPr>
+        <w:numPr>
+          <w:ilvl w:val="2"/>
+          <w:numId w:val="9"/>
+        </w:numPr>
+        <w:jc w:val="both"/>
+        <w:rPr>
+          <w:rFonts w:asciiTheme="minorHAnsi" w:eastAsiaTheme="minorHAnsi"/>
+        </w:rPr>
+      </w:pPr>
+      <w:r>
+        <w:rPr>
+          <w:rFonts w:asciiTheme="minorHAnsi" w:eastAsiaTheme="minorHAnsi"/>
+          <w:b/>
+          <w:bCs/>
+        </w:rPr>
+        <w:lastRenderedPageBreak/>
+        <w:t>ActionManager (행동 및 선택지 클래스)</w:t>
+      </w:r>
+      <w:r>
+        <w:rPr>
+          <w:rFonts w:asciiTheme="minorHAnsi" w:eastAsiaTheme="minorHAnsi"/>
+        </w:rPr>
+        <w:t xml:space="preserve">: </w:t>
+      </w:r>
+      <w:r>
+        <w:rPr>
+          <w:rFonts w:asciiTheme="minorHAnsi" w:eastAsiaTheme="minorHAnsi" w:hint="eastAsia"/>
+        </w:rPr>
+        <w:t>이중 선택지 로직 구현</w:t>
+      </w:r>
+    </w:p>
+    <w:p>
+      <w:pPr>
+        <w:ind w:left="1068"/>
+        <w:jc w:val="both"/>
+        <w:rPr>
+          <w:rFonts w:asciiTheme="minorHAnsi" w:eastAsiaTheme="minorHAnsi"/>
+        </w:rPr>
+      </w:pPr>
     </w:p>
     <w:p>
       <w:pPr>
@@ -5946,8 +4833,15 @@
           <w:b/>
           <w:bCs/>
         </w:rPr>
-        <w:lastRenderedPageBreak/>
         <w:t>아스키 아트 제작</w:t>
+      </w:r>
+      <w:r>
+        <w:rPr>
+          <w:rFonts w:asciiTheme="minorHAnsi" w:eastAsiaTheme="minorHAnsi" w:hint="eastAsia"/>
+          <w:b/>
+          <w:bCs/>
+        </w:rPr>
+        <w:t xml:space="preserve"> / 테스트 및 버그 수정</w:t>
       </w:r>
     </w:p>
     <w:p>
@@ -5958,26 +4852,16 @@
         </w:numPr>
         <w:jc w:val="both"/>
         <w:rPr>
-          <w:rFonts w:asciiTheme="minorHAnsi" w:eastAsiaTheme="minorHAnsi"/>
-        </w:rPr>
-      </w:pPr>
-      <w:proofErr w:type="spellStart"/>
-      <w:r>
-        <w:rPr>
-          <w:rFonts w:asciiTheme="minorHAnsi" w:eastAsiaTheme="minorHAnsi"/>
-          <w:b/>
-          <w:bCs/>
-        </w:rPr>
-        <w:t>UIRenderer</w:t>
-      </w:r>
-      <w:proofErr w:type="spellEnd"/>
-      <w:r>
-        <w:rPr>
-          <w:rFonts w:asciiTheme="minorHAnsi" w:eastAsiaTheme="minorHAnsi"/>
-          <w:b/>
-          <w:bCs/>
-        </w:rPr>
-        <w:t xml:space="preserve"> (화면 출력 클래스)</w:t>
+          <w:rFonts w:asciiTheme="minorHAnsi" w:eastAsiaTheme="minorHAnsi" w:hint="eastAsia"/>
+        </w:rPr>
+      </w:pPr>
+      <w:r>
+        <w:rPr>
+          <w:rFonts w:asciiTheme="minorHAnsi" w:eastAsiaTheme="minorHAnsi"/>
+          <w:b/>
+          <w:bCs/>
+        </w:rPr>
+        <w:t>UIRenderer (화면 출력 클래스)</w:t>
       </w:r>
       <w:r>
         <w:rPr>
@@ -6025,18 +4909,8 @@
           <w:b/>
           <w:bCs/>
         </w:rPr>
-        <w:t xml:space="preserve">: </w:t>
-      </w:r>
-      <w:proofErr w:type="spellStart"/>
-      <w:r>
-        <w:rPr>
-          <w:rFonts w:asciiTheme="minorHAnsi" w:eastAsiaTheme="minorHAnsi"/>
-          <w:b/>
-          <w:bCs/>
-        </w:rPr>
-        <w:t>유이레</w:t>
-      </w:r>
-      <w:proofErr w:type="spellEnd"/>
+        <w:t>: 유이레</w:t>
+      </w:r>
     </w:p>
     <w:p>
       <w:pPr>
@@ -6049,23 +4923,13 @@
           <w:rFonts w:asciiTheme="minorHAnsi" w:eastAsiaTheme="minorHAnsi"/>
         </w:rPr>
       </w:pPr>
-      <w:proofErr w:type="spellStart"/>
-      <w:r>
-        <w:rPr>
-          <w:rFonts w:asciiTheme="minorHAnsi" w:eastAsiaTheme="minorHAnsi"/>
-          <w:b/>
-          <w:bCs/>
-        </w:rPr>
-        <w:t>ActionManager</w:t>
-      </w:r>
-      <w:proofErr w:type="spellEnd"/>
-      <w:r>
-        <w:rPr>
-          <w:rFonts w:asciiTheme="minorHAnsi" w:eastAsiaTheme="minorHAnsi"/>
-          <w:b/>
-          <w:bCs/>
-        </w:rPr>
-        <w:t xml:space="preserve"> (행동 및 선택지 클래스)</w:t>
+      <w:r>
+        <w:rPr>
+          <w:rFonts w:asciiTheme="minorHAnsi" w:eastAsiaTheme="minorHAnsi"/>
+          <w:b/>
+          <w:bCs/>
+        </w:rPr>
+        <w:t>ActionManager (행동 및 선택지 클래스)</w:t>
       </w:r>
       <w:r>
         <w:rPr>
@@ -6082,40 +4946,7 @@
     </w:p>
     <w:p>
       <w:pPr>
-        <w:ind w:left="1068"/>
-        <w:rPr>
-          <w:rFonts w:asciiTheme="minorHAnsi" w:eastAsiaTheme="minorHAnsi"/>
-          <w:b/>
-          <w:bCs/>
-        </w:rPr>
-      </w:pPr>
-      <w:r>
-        <w:rPr>
-          <w:rFonts w:asciiTheme="minorHAnsi" w:eastAsiaTheme="minorHAnsi" w:hint="eastAsia"/>
-          <w:b/>
-          <w:bCs/>
-        </w:rPr>
-        <w:t>“</w:t>
-      </w:r>
-      <w:r>
-        <w:rPr>
-          <w:rFonts w:asciiTheme="minorHAnsi" w:eastAsiaTheme="minorHAnsi"/>
-          <w:b/>
-          <w:bCs/>
-        </w:rPr>
-        <w:t>최종 마무리 목표에 맞춰 전체 기능 구현 및 테스트를 완료하였습니다.</w:t>
-      </w:r>
-      <w:r>
-        <w:rPr>
-          <w:rFonts w:asciiTheme="minorHAnsi" w:eastAsiaTheme="minorHAnsi" w:hint="eastAsia"/>
-          <w:b/>
-          <w:bCs/>
-        </w:rPr>
-        <w:t>”</w:t>
-      </w:r>
-    </w:p>
-    <w:p>
-      <w:pPr>
+        <w:jc w:val="both"/>
         <w:rPr>
           <w:rFonts w:asciiTheme="minorHAnsi" w:eastAsiaTheme="minorHAnsi"/>
         </w:rPr>
@@ -6155,14 +4986,12 @@
       </w:r>
     </w:p>
     <w:p>
-      <w:proofErr w:type="gramStart"/>
       <w:r>
         <w:rPr>
           <w:rFonts w:hint="eastAsia"/>
         </w:rPr>
         <w:t>인생게임 :</w:t>
       </w:r>
-      <w:proofErr w:type="gramEnd"/>
     </w:p>
     <w:p>
       <w:pPr>
@@ -6185,22 +5014,12 @@
       </w:hyperlink>
     </w:p>
     <w:p>
-      <w:proofErr w:type="spellStart"/>
-      <w:proofErr w:type="gramStart"/>
       <w:r>
         <w:rPr>
           <w:rFonts w:hint="eastAsia"/>
         </w:rPr>
-        <w:t>다마고치</w:t>
-      </w:r>
-      <w:proofErr w:type="spellEnd"/>
-      <w:r>
-        <w:rPr>
-          <w:rFonts w:hint="eastAsia"/>
-        </w:rPr>
-        <w:t xml:space="preserve"> :</w:t>
-      </w:r>
-      <w:proofErr w:type="gramEnd"/>
+        <w:t>다마고치 :</w:t>
+      </w:r>
     </w:p>
     <w:p>
       <w:hyperlink r:id="rId12" w:history="1">
@@ -6218,21 +5037,7 @@
         <w:rPr>
           <w:rFonts w:hint="eastAsia"/>
         </w:rPr>
-        <w:t xml:space="preserve">UTF-8 </w:t>
-      </w:r>
-      <w:proofErr w:type="gramStart"/>
-      <w:r>
-        <w:rPr>
-          <w:rFonts w:hint="eastAsia"/>
-        </w:rPr>
-        <w:t>설정 :</w:t>
-      </w:r>
-      <w:proofErr w:type="gramEnd"/>
-      <w:r>
-        <w:rPr>
-          <w:rFonts w:hint="eastAsia"/>
-        </w:rPr>
-        <w:t xml:space="preserve"> </w:t>
+        <w:t xml:space="preserve">UTF-8 설정 : </w:t>
       </w:r>
     </w:p>
     <w:p>
@@ -6246,28 +5051,12 @@
       </w:hyperlink>
     </w:p>
     <w:p>
-      <w:proofErr w:type="spellStart"/>
       <w:r>
         <w:rPr>
           <w:rFonts w:hint="eastAsia"/>
         </w:rPr>
-        <w:t>windows.h</w:t>
-      </w:r>
-      <w:proofErr w:type="spellEnd"/>
-      <w:r>
-        <w:rPr>
-          <w:rFonts w:hint="eastAsia"/>
-        </w:rPr>
-        <w:t xml:space="preserve"> </w:t>
-      </w:r>
-      <w:proofErr w:type="gramStart"/>
-      <w:r>
-        <w:rPr>
-          <w:rFonts w:hint="eastAsia"/>
-        </w:rPr>
-        <w:t>헤더파일 :</w:t>
-      </w:r>
-      <w:proofErr w:type="gramEnd"/>
+        <w:t>windows.h 헤더파일 :</w:t>
+      </w:r>
     </w:p>
     <w:p>
       <w:r>

</xml_diff>